<commit_message>
Atualizações de código e correções - Recriado SQL e melhorado codigo Python (ainda necessário adaptar o CSV de consoles) - 14/10/2026
</commit_message>
<xml_diff>
--- a/UC02/Projeto_final_UC2/documentação/perguntas e respostas da analise.docx
+++ b/UC02/Projeto_final_UC2/documentação/perguntas e respostas da analise.docx
@@ -27980,136 +27980,55 @@
 </file>
 
 <file path=customXml/item2.xml><?xml version="1.0" encoding="utf-8"?>
-<ct:contentTypeSchema xmlns:ct="http://schemas.microsoft.com/office/2006/metadata/contentType" xmlns:ma="http://schemas.microsoft.com/office/2006/metadata/properties/metaAttributes" ct:_="" ma:_="" ma:contentTypeName="TemplateFile" ma:contentTypeID="0x0101006EDDDB5EE6D98C44930B742096920B300400F5B6D36B3EF94B4E9A635CDF2A18F5B8" ma:contentTypeVersion="72" ma:contentTypeDescription="Create a new document." ma:contentTypeScope="" ma:versionID="a23e56308344d904b51738559c3d67c9">
-  <xsd:schema xmlns:xsd="http://www.w3.org/2001/XMLSchema" xmlns:xs="http://www.w3.org/2001/XMLSchema" xmlns:p="http://schemas.microsoft.com/office/2006/metadata/properties" xmlns:ns2="4873beb7-5857-4685-be1f-d57550cc96cc" targetNamespace="http://schemas.microsoft.com/office/2006/metadata/properties" ma:root="true" ma:fieldsID="cd0908cc4600e77bf5da051303e00c8d" ns2:_="">
-    <xsd:import namespace="4873beb7-5857-4685-be1f-d57550cc96cc"/>
+<ct:contentTypeSchema xmlns:ct="http://schemas.microsoft.com/office/2006/metadata/contentType" xmlns:ma="http://schemas.microsoft.com/office/2006/metadata/properties/metaAttributes" ct:_="" ma:_="" ma:contentTypeName="Documento" ma:contentTypeID="0x010100CD51460BBB3BD64989C0AF0085EB7E4E" ma:contentTypeVersion="42" ma:contentTypeDescription="Crie um novo documento." ma:contentTypeScope="" ma:versionID="d9ea4bfe24da9323925474f8e7a5d9c2">
+  <xsd:schema xmlns:xsd="http://www.w3.org/2001/XMLSchema" xmlns:xs="http://www.w3.org/2001/XMLSchema" xmlns:p="http://schemas.microsoft.com/office/2006/metadata/properties" xmlns:ns2="86243fb6-e625-4153-bf24-3dbb8808cb3e" xmlns:ns3="29c85e31-c0e5-4fba-ab60-4fce8ca17cbc" targetNamespace="http://schemas.microsoft.com/office/2006/metadata/properties" ma:root="true" ma:fieldsID="96066f67e9ef9d03c561a9b1a7d8b26b" ns2:_="" ns3:_="">
+    <xsd:import namespace="86243fb6-e625-4153-bf24-3dbb8808cb3e"/>
+    <xsd:import namespace="29c85e31-c0e5-4fba-ab60-4fce8ca17cbc"/>
     <xsd:element name="properties">
       <xsd:complexType>
         <xsd:sequence>
           <xsd:element name="documentManagement">
             <xsd:complexType>
               <xsd:all>
-                <xsd:element ref="ns2:AcquiredFrom" minOccurs="0"/>
-                <xsd:element ref="ns2:UACurrentWords" minOccurs="0"/>
-                <xsd:element ref="ns2:TPApplication" minOccurs="0"/>
-                <xsd:element ref="ns2:ApprovalLog" minOccurs="0"/>
-                <xsd:element ref="ns2:ApprovalStatus" minOccurs="0"/>
-                <xsd:element ref="ns2:AssetStart" minOccurs="0"/>
-                <xsd:element ref="ns2:AssetExpire" minOccurs="0"/>
-                <xsd:element ref="ns2:AssetId" minOccurs="0"/>
-                <xsd:element ref="ns2:IsSearchable" minOccurs="0"/>
-                <xsd:element ref="ns2:AssetType" minOccurs="0"/>
-                <xsd:element ref="ns2:APAuthor" minOccurs="0"/>
-                <xsd:element ref="ns2:AverageRating" minOccurs="0"/>
-                <xsd:element ref="ns2:BlockPublish" minOccurs="0"/>
-                <xsd:element ref="ns2:BugNumber" minOccurs="0"/>
-                <xsd:element ref="ns2:CampaignTagsTaxHTField0" minOccurs="0"/>
-                <xsd:element ref="ns2:TPClientViewer" minOccurs="0"/>
-                <xsd:element ref="ns2:ClipArtFilename" minOccurs="0"/>
-                <xsd:element ref="ns2:TPCommandLine" minOccurs="0"/>
-                <xsd:element ref="ns2:TPComponent" minOccurs="0"/>
-                <xsd:element ref="ns2:ContentItem" minOccurs="0"/>
-                <xsd:element ref="ns2:CrawlForDependencies" minOccurs="0"/>
-                <xsd:element ref="ns2:CSXHash" minOccurs="0"/>
-                <xsd:element ref="ns2:CSXSubmissionMarket" minOccurs="0"/>
-                <xsd:element ref="ns2:CSXUpdate" minOccurs="0"/>
-                <xsd:element ref="ns2:IntlLangReviewDate" minOccurs="0"/>
-                <xsd:element ref="ns2:IsDeleted" minOccurs="0"/>
-                <xsd:element ref="ns2:APDescription" minOccurs="0"/>
-                <xsd:element ref="ns2:DirectSourceMarket" minOccurs="0"/>
-                <xsd:element ref="ns2:Downloads" minOccurs="0"/>
-                <xsd:element ref="ns2:DSATActionTaken" minOccurs="0"/>
-                <xsd:element ref="ns2:APEditor" minOccurs="0"/>
-                <xsd:element ref="ns2:EditorialStatus" minOccurs="0"/>
-                <xsd:element ref="ns2:EditorialTags" minOccurs="0"/>
-                <xsd:element ref="ns2:TPExecutable" minOccurs="0"/>
-                <xsd:element ref="ns2:FeatureTagsTaxHTField0" minOccurs="0"/>
-                <xsd:element ref="ns2:TPFriendlyName" minOccurs="0"/>
-                <xsd:element ref="ns2:FriendlyTitle" minOccurs="0"/>
-                <xsd:element ref="ns2:PrimaryImageGen" minOccurs="0"/>
-                <xsd:element ref="ns2:HandoffToMSDN" minOccurs="0"/>
-                <xsd:element ref="ns2:InProjectListLookup" minOccurs="0"/>
-                <xsd:element ref="ns2:TPInstallLocation" minOccurs="0"/>
-                <xsd:element ref="ns2:InternalTagsTaxHTField0" minOccurs="0"/>
-                <xsd:element ref="ns2:IntlLangReview" minOccurs="0"/>
-                <xsd:element ref="ns2:IntlLangReviewer" minOccurs="0"/>
-                <xsd:element ref="ns2:MarketSpecific" minOccurs="0"/>
-                <xsd:element ref="ns2:LastCompleteVersionLookup" minOccurs="0"/>
-                <xsd:element ref="ns2:LastHandOff" minOccurs="0"/>
-                <xsd:element ref="ns2:LastModifiedDateTime" minOccurs="0"/>
-                <xsd:element ref="ns2:LastPreviewErrorLookup" minOccurs="0"/>
-                <xsd:element ref="ns2:LastPreviewResultLookup" minOccurs="0"/>
-                <xsd:element ref="ns2:LastPreviewAttemptDateLookup" minOccurs="0"/>
-                <xsd:element ref="ns2:LastPreviewedByLookup" minOccurs="0"/>
-                <xsd:element ref="ns2:LastPreviewTimeLookup" minOccurs="0"/>
-                <xsd:element ref="ns2:LastPreviewVersionLookup" minOccurs="0"/>
-                <xsd:element ref="ns2:LastPublishErrorLookup" minOccurs="0"/>
-                <xsd:element ref="ns2:LastPublishResultLookup" minOccurs="0"/>
-                <xsd:element ref="ns2:LastPublishAttemptDateLookup" minOccurs="0"/>
-                <xsd:element ref="ns2:LastPublishedByLookup" minOccurs="0"/>
-                <xsd:element ref="ns2:LastPublishTimeLookup" minOccurs="0"/>
-                <xsd:element ref="ns2:LastPublishVersionLookup" minOccurs="0"/>
-                <xsd:element ref="ns2:TPLaunchHelpLinkType" minOccurs="0"/>
-                <xsd:element ref="ns2:LegacyData" minOccurs="0"/>
-                <xsd:element ref="ns2:TPLaunchHelpLink" minOccurs="0"/>
-                <xsd:element ref="ns2:LocComments" minOccurs="0"/>
-                <xsd:element ref="ns2:LocLastLocAttemptVersionLookup" minOccurs="0"/>
-                <xsd:element ref="ns2:LocLastLocAttemptVersionTypeLookup" minOccurs="0"/>
-                <xsd:element ref="ns2:LocManualTestRequired" minOccurs="0"/>
-                <xsd:element ref="ns2:LocMarketGroupTiers2" minOccurs="0"/>
-                <xsd:element ref="ns2:LocNewPublishedVersionLookup" minOccurs="0"/>
-                <xsd:element ref="ns2:LocOverallHandbackStatusLookup" minOccurs="0"/>
-                <xsd:element ref="ns2:LocOverallLocStatusLookup" minOccurs="0"/>
-                <xsd:element ref="ns2:LocOverallPreviewStatusLookup" minOccurs="0"/>
-                <xsd:element ref="ns2:LocOverallPublishStatusLookup" minOccurs="0"/>
-                <xsd:element ref="ns2:IntlLocPriority" minOccurs="0"/>
-                <xsd:element ref="ns2:LocProcessedForHandoffsLookup" minOccurs="0"/>
-                <xsd:element ref="ns2:LocProcessedForMarketsLookup" minOccurs="0"/>
-                <xsd:element ref="ns2:LocPublishedDependentAssetsLookup" minOccurs="0"/>
-                <xsd:element ref="ns2:LocPublishedLinkedAssetsLookup" minOccurs="0"/>
-                <xsd:element ref="ns2:LocRecommendedHandoff" minOccurs="0"/>
-                <xsd:element ref="ns2:LocalizationTagsTaxHTField0" minOccurs="0"/>
-                <xsd:element ref="ns2:MachineTranslated" minOccurs="0"/>
-                <xsd:element ref="ns2:Manager" minOccurs="0"/>
-                <xsd:element ref="ns2:Markets" minOccurs="0"/>
-                <xsd:element ref="ns2:Milestone" minOccurs="0"/>
-                <xsd:element ref="ns2:TPNamespace" minOccurs="0"/>
-                <xsd:element ref="ns2:NumericId" minOccurs="0"/>
-                <xsd:element ref="ns2:NumOfRatingsLookup" minOccurs="0"/>
-                <xsd:element ref="ns2:OOCacheId" minOccurs="0"/>
-                <xsd:element ref="ns2:OpenTemplate" minOccurs="0"/>
-                <xsd:element ref="ns2:OriginAsset" minOccurs="0"/>
-                <xsd:element ref="ns2:OriginalRelease" minOccurs="0"/>
-                <xsd:element ref="ns2:OriginalSourceMarket" minOccurs="0"/>
-                <xsd:element ref="ns2:OutputCachingOn" minOccurs="0"/>
-                <xsd:element ref="ns2:ParentAssetId" minOccurs="0"/>
-                <xsd:element ref="ns2:PlannedPubDate" minOccurs="0"/>
-                <xsd:element ref="ns2:PolicheckWords" minOccurs="0"/>
-                <xsd:element ref="ns2:BusinessGroup" minOccurs="0"/>
-                <xsd:element ref="ns2:UAProjectedTotalWords" minOccurs="0"/>
-                <xsd:element ref="ns2:Provider" minOccurs="0"/>
-                <xsd:element ref="ns2:Providers" minOccurs="0"/>
-                <xsd:element ref="ns2:PublishStatusLookup" minOccurs="0"/>
-                <xsd:element ref="ns2:PublishTargets" minOccurs="0"/>
-                <xsd:element ref="ns2:RecommendationsModifier" minOccurs="0"/>
-                <xsd:element ref="ns2:ArtSampleDocs" minOccurs="0"/>
-                <xsd:element ref="ns2:ScenarioTagsTaxHTField0" minOccurs="0"/>
-                <xsd:element ref="ns2:ShowIn" minOccurs="0"/>
-                <xsd:element ref="ns2:SourceTitle" minOccurs="0"/>
-                <xsd:element ref="ns2:CSXSubmissionDate" minOccurs="0"/>
-                <xsd:element ref="ns2:SubmitterId" minOccurs="0"/>
-                <xsd:element ref="ns2:TaxCatchAll" minOccurs="0"/>
-                <xsd:element ref="ns2:TaxCatchAllLabel" minOccurs="0"/>
-                <xsd:element ref="ns2:TemplateStatus" minOccurs="0"/>
-                <xsd:element ref="ns2:TemplateTemplateType" minOccurs="0"/>
-                <xsd:element ref="ns2:ThumbnailAssetId" minOccurs="0"/>
-                <xsd:element ref="ns2:TimesCloned" minOccurs="0"/>
-                <xsd:element ref="ns2:TrustLevel" minOccurs="0"/>
-                <xsd:element ref="ns2:UALocComments" minOccurs="0"/>
-                <xsd:element ref="ns2:UALocRecommendation" minOccurs="0"/>
-                <xsd:element ref="ns2:UANotes" minOccurs="0"/>
-                <xsd:element ref="ns2:TPAppVersion" minOccurs="0"/>
-                <xsd:element ref="ns2:VoteCount" minOccurs="0"/>
+                <xsd:element ref="ns2:_Flow_SignoffStatus" minOccurs="0"/>
+                <xsd:element ref="ns2:AULASESCRITAS" minOccurs="0"/>
+                <xsd:element ref="ns2:Indentidadevisualaula4" minOccurs="0"/>
+                <xsd:element ref="ns3:SharedWithUsers" minOccurs="0"/>
+                <xsd:element ref="ns3:SharedWithDetails" minOccurs="0"/>
+                <xsd:element ref="ns2:MediaServiceMetadata" minOccurs="0"/>
+                <xsd:element ref="ns2:MediaServiceFastMetadata" minOccurs="0"/>
+                <xsd:element ref="ns2:MediaServiceObjectDetectorVersions" minOccurs="0"/>
+                <xsd:element ref="ns2:MediaServiceSearchProperties" minOccurs="0"/>
+                <xsd:element ref="ns2:MediaServiceDateTaken" minOccurs="0"/>
+                <xsd:element ref="ns2:MediaServiceGenerationTime" minOccurs="0"/>
+                <xsd:element ref="ns2:MediaServiceEventHashCode" minOccurs="0"/>
+                <xsd:element ref="ns2:MediaLengthInSeconds" minOccurs="0"/>
+                <xsd:element ref="ns2:lcf76f155ced4ddcb4097134ff3c332f" minOccurs="0"/>
+                <xsd:element ref="ns3:TaxCatchAll" minOccurs="0"/>
+                <xsd:element ref="ns2:MediaServiceOCR" minOccurs="0"/>
+                <xsd:element ref="ns2:MediaServiceLocation" minOccurs="0"/>
+                <xsd:element ref="ns2:MediaServiceBillingMetadata" minOccurs="0"/>
+                <xsd:element ref="ns2:_ApprovalAssignedTo" minOccurs="0"/>
+                <xsd:element ref="ns2:_ApprovalRespondedBy" minOccurs="0"/>
+                <xsd:element ref="ns2:_ApprovalSentBy" minOccurs="0"/>
+                <xsd:element ref="ns2:_ApprovalStatus" minOccurs="0"/>
+                <xsd:element ref="ns2:Guiadeservi_x00e7_o" minOccurs="0"/>
+                <xsd:element ref="ns2:entrevista" minOccurs="0"/>
+                <xsd:element ref="ns2:Eduarda_x002c_Lohanaevilma" minOccurs="0"/>
+                <xsd:element ref="ns2:emmanuelG" minOccurs="0"/>
+                <xsd:element ref="ns2:Como_x0020_esse_x0020_problema_x0020_aparece_x0020_entre_x0020_os_x0020_jovens_x003f_"/>
+                <xsd:element ref="ns2:Como_x0020_a_x0020_Sociologia_x0020_poderia_x0020_explicar_x0020_isso_x003f_"/>
+                <xsd:element ref="ns2:Nomes"/>
+                <xsd:element ref="ns2:TEXTO_x002d_BASE_x0020_DO_x0020_ESTUDO" minOccurs="0"/>
+                <xsd:element ref="ns2:Identifique_x0020_tr_x00ea_s_x0020_institui_x00e7__x00f5_es_x0020_sociais_x0020_presentes_x0020_no_x0020_caso_x0020_descrito_x0020_e_x0020_explique_x0020_brevemente_x0020_qual_x0020__x00e9__x0020_o_x0020_papel_x0020_de_x0020_cada_x0020_uma_x0020_na_x0020_organiza_x00e7__x00e3_o_x0020_da_x0020_vida_x0020_social_x002e_"/>
+                <xsd:element ref="ns2:Explique_x002c__x0020_a_x0020_partir_x0020_do_x0020_texto_x002c__x0020_como_x0020_o_x0020_processo_x0020_de_x0020_socializa_x00e7__x00e3_o_x0020_contribui_x0020_para_x0020_que_x0020_Camila_x0020_consiga_x0020_agir_x0020_de_x0020_maneiras_x0020_diferentes_x0020_em_x0020_cada_x0020_ambiente_x0020_social_x002e_"/>
+                <xsd:element ref="ns2:No_x0020_texto_x002c__x0020_Camila_x0020_assume_x0020_a_x0020_fun_x00e7__x00e3_o_x0020_de_x0020_apresentar_x0020_o_x0020_trabalho_x0020_em_x0020_sala_x0020_de_x0020_aula_x002e__x0020_Explique_x0020_como_x0020_essa_x0020_situa_x00e7__x00e3_o_x0020_pode_x0020_ser_x0020_compreendida_x0020_a_x0020_partir_x0020_do_x0020_conceito_x0020_de_x0020_papel_x0020_social_x002e_"/>
+                <xsd:element ref="ns2:Explique_x0020_por_x0020_que_x0020_uma_x0020_mesma_x0020_pessoa_x0020_pode_x0020_desempenhar_x0020_v_x00e1_rios_x0020_pap_x00e9_is_x0020_sociais_x0020_diferentes_x0020_ao_x0020_longo_x0020_de_x0020_um_x0020_mesmo_x0020_dia_x002e_"/>
+                <xsd:element ref="ns2:A_x0020_partir_x0020_das_x0020_ideias_x0020_de_x0020_Erving_x0020_Goffman_x002c__x0020_explique_x0020_por_x0020_que_x0020_Camila_x0020_controla_x0020_sua_x0020_forma_x0020_de_x0020_falar_x0020_e_x0020_de_x0020_se_x0020_comportar_x0020_em_x0020_determinados_x0020_contextos_x0020_sociais_x002e_"/>
+                <xsd:element ref="ns2:Utilizando_x0020_o_x0020_conceito_x0020_de_x0020_apresenta_x00e7__x00e3_o_x0020_de_x0020_si_x002c__x0020_explique_x0020_como_x0020_o_x0020_comportamento_x0020_de_x0020_Camila_x0020_no_x0020_ambiente_x0020_de_x0020_trabalho_x0020_pode_x0020_ser_x0020_interpretado_x0020_sociologicamente_x002e_"/>
+                <xsd:element ref="ns2:Explique_x0020_a_x0020_rela_x00e7__x00e3_o_x0020_entre_x0020_institui_x00e7__x00f5_es_x0020_sociais_x0020_e_x0020_processos_x0020_de_x0020_socializa_x00e7__x00e3_o_x0020_na_x0020_forma_x00e7__x00e3_o_x0020_dos_x0020_comportamentos_x0020_observados_x0020_no_x0020_texto_x002e_"/>
+                <xsd:element ref="ns2:O_x0020_caso_x0020_apresentado_x0020_mostra_x0020_que_x0020_diferentes_x0020_ambientes_x0020_possuem_x0020_normas_x0020_e_x0020_expectativas_x0020_espec_x00ed_ficas_x002e__x0020_Explique_x0020_por_x0020_que_x0020_a_x0020_exist_x00ea_ncia_x0020_dessas_x0020_normas_x0020__x00e9__x0020_importante_x0020_para_x0020_o_x0020_funcionamento_x0020_da_x0020_vida_x0020_social_x002e_"/>
+                <xsd:element ref="ns2:A_x0020_partir_x0020_do_x0020_caso_x0020_analisado_x002c__x0020_explique_x0020_como_x0020_os_x0020_conceitos_x0020_de_x0020_institui_x00e7__x00e3_o_x0020_social_x002c__x0020_socializa_x00e7__x00e3_o_x0020_e_x0020_papel_x0020_social_x0020_est_x00e3_o_x0020_interligados_x002e_"/>
               </xsd:all>
             </xsd:complexType>
           </xsd:element>
@@ -28117,79 +28036,127 @@
       </xsd:complexType>
     </xsd:element>
   </xsd:schema>
-  <xsd:schema xmlns:xsd="http://www.w3.org/2001/XMLSchema" xmlns:xs="http://www.w3.org/2001/XMLSchema" xmlns:dms="http://schemas.microsoft.com/office/2006/documentManagement/types" xmlns:pc="http://schemas.microsoft.com/office/infopath/2007/PartnerControls" targetNamespace="4873beb7-5857-4685-be1f-d57550cc96cc" elementFormDefault="qualified">
+  <xsd:schema xmlns:xsd="http://www.w3.org/2001/XMLSchema" xmlns:xs="http://www.w3.org/2001/XMLSchema" xmlns:dms="http://schemas.microsoft.com/office/2006/documentManagement/types" xmlns:pc="http://schemas.microsoft.com/office/infopath/2007/PartnerControls" targetNamespace="86243fb6-e625-4153-bf24-3dbb8808cb3e" elementFormDefault="qualified">
     <xsd:import namespace="http://schemas.microsoft.com/office/2006/documentManagement/types"/>
     <xsd:import namespace="http://schemas.microsoft.com/office/infopath/2007/PartnerControls"/>
-    <xsd:element name="AcquiredFrom" ma:index="1" nillable="true" ma:displayName="Acquired From" ma:default="Internal MS" ma:internalName="AcquiredFrom" ma:readOnly="false">
-      <xsd:simpleType>
-        <xsd:restriction base="dms:Choice">
-          <xsd:enumeration value="Internal MS"/>
-          <xsd:enumeration value="Community"/>
-          <xsd:enumeration value="MVP"/>
-          <xsd:enumeration value="Publisher"/>
-          <xsd:enumeration value="Partner"/>
-          <xsd:enumeration value="None"/>
-        </xsd:restriction>
-      </xsd:simpleType>
-    </xsd:element>
-    <xsd:element name="UACurrentWords" ma:index="2" nillable="true" ma:displayName="Actual Word Count" ma:default="" ma:internalName="UACurrentWords" ma:readOnly="false">
-      <xsd:simpleType>
-        <xsd:restriction base="dms:Unknown"/>
-      </xsd:simpleType>
-    </xsd:element>
-    <xsd:element name="TPApplication" ma:index="3" nillable="true" ma:displayName="Application to Open Template With" ma:default="" ma:internalName="TPApplication">
+    <xsd:element name="_Flow_SignoffStatus" ma:index="3" nillable="true" ma:displayName="Status de liberação" ma:internalName="Status_x0020_de_x0020_libera_x00e7__x00e3_o">
       <xsd:simpleType>
         <xsd:restriction base="dms:Text"/>
       </xsd:simpleType>
     </xsd:element>
-    <xsd:element name="ApprovalLog" ma:index="4" nillable="true" ma:displayName="Approval Log" ma:default="" ma:hidden="true" ma:internalName="ApprovalLog" ma:readOnly="false">
-      <xsd:simpleType>
-        <xsd:restriction base="dms:Note"/>
-      </xsd:simpleType>
-    </xsd:element>
-    <xsd:element name="ApprovalStatus" ma:index="5" nillable="true" ma:displayName="Approval Status" ma:default="InProgress" ma:internalName="ApprovalStatus" ma:readOnly="false">
-      <xsd:simpleType>
-        <xsd:restriction base="dms:Choice">
-          <xsd:enumeration value="InProgress"/>
-          <xsd:enumeration value="Rejected"/>
-          <xsd:enumeration value="Questionable"/>
-          <xsd:enumeration value="ApprovedAutomatic"/>
-          <xsd:enumeration value="ApprovedManual"/>
-          <xsd:enumeration value="On Hold"/>
-          <xsd:enumeration value="Needs Review"/>
-          <xsd:enumeration value="A Violation"/>
-          <xsd:enumeration value="Unpublished Violation"/>
-        </xsd:restriction>
-      </xsd:simpleType>
-    </xsd:element>
-    <xsd:element name="AssetStart" ma:index="6" nillable="true" ma:displayName="Asset Begin Date" ma:default="[Today]" ma:internalName="AssetStart" ma:readOnly="false">
-      <xsd:simpleType>
-        <xsd:restriction base="dms:DateTime"/>
-      </xsd:simpleType>
-    </xsd:element>
-    <xsd:element name="AssetExpire" ma:index="7" nillable="true" ma:displayName="Asset End Date" ma:default="2029-01-01T08:00:00Z" ma:format="DateTime" ma:internalName="AssetExpire" ma:readOnly="false">
-      <xsd:simpleType>
-        <xsd:restriction base="dms:DateTime"/>
-      </xsd:simpleType>
-    </xsd:element>
-    <xsd:element name="AssetId" ma:index="8" nillable="true" ma:displayName="Asset ID" ma:default="" ma:indexed="true" ma:internalName="AssetId" ma:readOnly="false">
+    <xsd:element name="AULASESCRITAS" ma:index="4" nillable="true" ma:displayName="AULAS ESCRITAS" ma:description="Descrição" ma:indexed="true" ma:internalName="AULASESCRITAS">
       <xsd:simpleType>
         <xsd:restriction base="dms:Text">
           <xsd:maxLength value="255"/>
         </xsd:restriction>
       </xsd:simpleType>
     </xsd:element>
-    <xsd:element name="IsSearchable" ma:index="9" nillable="true" ma:displayName="Asset Searchable?" ma:default="true" ma:internalName="IsSearchable" ma:readOnly="false">
-      <xsd:simpleType>
-        <xsd:restriction base="dms:Boolean"/>
-      </xsd:simpleType>
-    </xsd:element>
-    <xsd:element name="AssetType" ma:index="10" nillable="true" ma:displayName="Asset Type" ma:default="" ma:internalName="AssetType" ma:readOnly="false">
+    <xsd:element name="Indentidadevisualaula4" ma:index="5" nillable="true" ma:displayName="Indentidade visual aula 4" ma:internalName="Indentidadevisualaula4">
       <xsd:simpleType>
         <xsd:restriction base="dms:Unknown"/>
       </xsd:simpleType>
     </xsd:element>
-    <xsd:element name="APAuthor" ma:index="11" nillable="true" ma:displayName="Author" ma:default="" ma:list="UserInfo" ma:internalName="APAuthor" ma:readOnly="false">
+    <xsd:element name="MediaServiceMetadata" ma:index="10" nillable="true" ma:displayName="MediaServiceMetadata" ma:hidden="true" ma:internalName="MediaServiceMetadata" ma:readOnly="true">
+      <xsd:simpleType>
+        <xsd:restriction base="dms:Note"/>
+      </xsd:simpleType>
+    </xsd:element>
+    <xsd:element name="MediaServiceFastMetadata" ma:index="11" nillable="true" ma:displayName="MediaServiceFastMetadata" ma:hidden="true" ma:internalName="MediaServiceFastMetadata" ma:readOnly="true">
+      <xsd:simpleType>
+        <xsd:restriction base="dms:Note"/>
+      </xsd:simpleType>
+    </xsd:element>
+    <xsd:element name="MediaServiceObjectDetectorVersions" ma:index="12" nillable="true" ma:displayName="MediaServiceObjectDetectorVersions" ma:hidden="true" ma:indexed="true" ma:internalName="MediaServiceObjectDetectorVersions" ma:readOnly="true">
+      <xsd:simpleType>
+        <xsd:restriction base="dms:Text"/>
+      </xsd:simpleType>
+    </xsd:element>
+    <xsd:element name="MediaServiceSearchProperties" ma:index="13" nillable="true" ma:displayName="MediaServiceSearchProperties" ma:hidden="true" ma:internalName="MediaServiceSearchProperties" ma:readOnly="true">
+      <xsd:simpleType>
+        <xsd:restriction base="dms:Note"/>
+      </xsd:simpleType>
+    </xsd:element>
+    <xsd:element name="MediaServiceDateTaken" ma:index="14" nillable="true" ma:displayName="MediaServiceDateTaken" ma:hidden="true" ma:indexed="true" ma:internalName="MediaServiceDateTaken" ma:readOnly="true">
+      <xsd:simpleType>
+        <xsd:restriction base="dms:Text"/>
+      </xsd:simpleType>
+    </xsd:element>
+    <xsd:element name="MediaServiceGenerationTime" ma:index="15" nillable="true" ma:displayName="MediaServiceGenerationTime" ma:hidden="true" ma:internalName="MediaServiceGenerationTime" ma:readOnly="true">
+      <xsd:simpleType>
+        <xsd:restriction base="dms:Text"/>
+      </xsd:simpleType>
+    </xsd:element>
+    <xsd:element name="MediaServiceEventHashCode" ma:index="16" nillable="true" ma:displayName="MediaServiceEventHashCode" ma:hidden="true" ma:internalName="MediaServiceEventHashCode" ma:readOnly="true">
+      <xsd:simpleType>
+        <xsd:restriction base="dms:Text"/>
+      </xsd:simpleType>
+    </xsd:element>
+    <xsd:element name="MediaLengthInSeconds" ma:index="17" nillable="true" ma:displayName="MediaLengthInSeconds" ma:hidden="true" ma:internalName="MediaLengthInSeconds" ma:readOnly="true">
+      <xsd:simpleType>
+        <xsd:restriction base="dms:Unknown"/>
+      </xsd:simpleType>
+    </xsd:element>
+    <xsd:element name="lcf76f155ced4ddcb4097134ff3c332f" ma:index="19" nillable="true" ma:taxonomy="true" ma:internalName="lcf76f155ced4ddcb4097134ff3c332f" ma:taxonomyFieldName="MediaServiceImageTags" ma:displayName="Marcações de imagem" ma:readOnly="false" ma:fieldId="{5cf76f15-5ced-4ddc-b409-7134ff3c332f}" ma:taxonomyMulti="true" ma:sspId="e9a2855a-918e-4771-8d49-1fa7ae9a9e76" ma:termSetId="09814cd3-568e-fe90-9814-8d621ff8fb84" ma:anchorId="fba54fb3-c3e1-fe81-a776-ca4b69148c4d" ma:open="true" ma:isKeyword="false">
+      <xsd:complexType>
+        <xsd:sequence>
+          <xsd:element ref="pc:Terms" minOccurs="0" maxOccurs="1"/>
+        </xsd:sequence>
+      </xsd:complexType>
+    </xsd:element>
+    <xsd:element name="MediaServiceOCR" ma:index="21" nillable="true" ma:displayName="Extracted Text" ma:hidden="true" ma:internalName="MediaServiceOCR" ma:readOnly="true">
+      <xsd:simpleType>
+        <xsd:restriction base="dms:Note"/>
+      </xsd:simpleType>
+    </xsd:element>
+    <xsd:element name="MediaServiceLocation" ma:index="22" nillable="true" ma:displayName="Location" ma:hidden="true" ma:indexed="true" ma:internalName="MediaServiceLocation" ma:readOnly="true">
+      <xsd:simpleType>
+        <xsd:restriction base="dms:Text"/>
+      </xsd:simpleType>
+    </xsd:element>
+    <xsd:element name="MediaServiceBillingMetadata" ma:index="26" nillable="true" ma:displayName="MediaServiceBillingMetadata" ma:hidden="true" ma:internalName="MediaServiceBillingMetadata" ma:readOnly="true">
+      <xsd:simpleType>
+        <xsd:restriction base="dms:Note"/>
+      </xsd:simpleType>
+    </xsd:element>
+    <xsd:element name="_ApprovalAssignedTo" ma:index="27" nillable="true" ma:displayName="Aprovadores" ma:list="UserInfo" ma:internalName="_ApprovalAssignedTo" ma:readOnly="true">
+      <xsd:complexType>
+        <xsd:complexContent>
+          <xsd:extension base="dms:UserMulti">
+            <xsd:sequence>
+              <xsd:element name="UserInfo" minOccurs="0" maxOccurs="unbounded">
+                <xsd:complexType>
+                  <xsd:sequence>
+                    <xsd:element name="DisplayName" type="xsd:string" minOccurs="0"/>
+                    <xsd:element name="AccountId" type="dms:UserId" minOccurs="0" nillable="true"/>
+                    <xsd:element name="AccountType" type="xsd:string" minOccurs="0"/>
+                  </xsd:sequence>
+                </xsd:complexType>
+              </xsd:element>
+            </xsd:sequence>
+          </xsd:extension>
+        </xsd:complexContent>
+      </xsd:complexType>
+    </xsd:element>
+    <xsd:element name="_ApprovalRespondedBy" ma:index="28" nillable="true" ma:displayName="Respostas" ma:list="UserInfo" ma:internalName="_ApprovalRespondedBy" ma:readOnly="true">
+      <xsd:complexType>
+        <xsd:complexContent>
+          <xsd:extension base="dms:UserMulti">
+            <xsd:sequence>
+              <xsd:element name="UserInfo" minOccurs="0" maxOccurs="unbounded">
+                <xsd:complexType>
+                  <xsd:sequence>
+                    <xsd:element name="DisplayName" type="xsd:string" minOccurs="0"/>
+                    <xsd:element name="AccountId" type="dms:UserId" minOccurs="0" nillable="true"/>
+                    <xsd:element name="AccountType" type="xsd:string" minOccurs="0"/>
+                  </xsd:sequence>
+                </xsd:complexType>
+              </xsd:element>
+            </xsd:sequence>
+          </xsd:extension>
+        </xsd:complexContent>
+      </xsd:complexType>
+    </xsd:element>
+    <xsd:element name="_ApprovalSentBy" ma:index="29" nillable="true" ma:displayName="Criador de Aprovação" ma:list="UserInfo" ma:internalName="_ApprovalSentBy" ma:readOnly="true">
       <xsd:complexType>
         <xsd:complexContent>
           <xsd:extension base="dms:User">
@@ -28208,112 +28175,137 @@
         </xsd:complexContent>
       </xsd:complexType>
     </xsd:element>
-    <xsd:element name="AverageRating" ma:index="12" nillable="true" ma:displayName="Average Rating" ma:internalName="AverageRating" ma:readOnly="false">
-      <xsd:simpleType>
-        <xsd:restriction base="dms:Text"/>
-      </xsd:simpleType>
-    </xsd:element>
-    <xsd:element name="BlockPublish" ma:index="13" nillable="true" ma:displayName="Block from Publishing?" ma:default="" ma:internalName="BlockPublish" ma:readOnly="false">
-      <xsd:simpleType>
-        <xsd:restriction base="dms:Boolean"/>
-      </xsd:simpleType>
-    </xsd:element>
-    <xsd:element name="BugNumber" ma:index="14" nillable="true" ma:displayName="Bug Number" ma:default="" ma:internalName="BugNumber" ma:readOnly="false">
-      <xsd:simpleType>
-        <xsd:restriction base="dms:Text"/>
-      </xsd:simpleType>
-    </xsd:element>
-    <xsd:element name="CampaignTagsTaxHTField0" ma:index="16" nillable="true" ma:taxonomy="true" ma:internalName="CampaignTagsTaxHTField0" ma:taxonomyFieldName="CampaignTags" ma:displayName="Campaigns" ma:readOnly="false" ma:default="" ma:fieldId="{1df42cc3-2301-4f11-a52a-6ead923c29ed}" ma:taxonomyMulti="true" ma:sspId="8f79753a-75d3-41f5-8ca3-40b843941b4f" ma:termSetId="ca0e50d4-faa1-44ce-961e-bb1441c60e66" ma:anchorId="00000000-0000-0000-0000-000000000000" ma:open="false" ma:isKeyword="false">
-      <xsd:complexType>
-        <xsd:sequence>
-          <xsd:element ref="pc:Terms" minOccurs="0" maxOccurs="1"/>
-        </xsd:sequence>
-      </xsd:complexType>
-    </xsd:element>
-    <xsd:element name="TPClientViewer" ma:index="17" nillable="true" ma:displayName="Client Viewer" ma:default="" ma:internalName="TPClientViewer">
-      <xsd:simpleType>
-        <xsd:restriction base="dms:Text"/>
-      </xsd:simpleType>
-    </xsd:element>
-    <xsd:element name="ClipArtFilename" ma:index="18" nillable="true" ma:displayName="Clip Art Name" ma:default="" ma:internalName="ClipArtFilename" ma:readOnly="false">
-      <xsd:simpleType>
-        <xsd:restriction base="dms:Text"/>
-      </xsd:simpleType>
-    </xsd:element>
-    <xsd:element name="TPCommandLine" ma:index="19" nillable="true" ma:displayName="Command Line" ma:default="" ma:internalName="TPCommandLine">
-      <xsd:simpleType>
-        <xsd:restriction base="dms:Text"/>
-      </xsd:simpleType>
-    </xsd:element>
-    <xsd:element name="TPComponent" ma:index="20" nillable="true" ma:displayName="Component" ma:default="" ma:internalName="TPComponent">
-      <xsd:simpleType>
-        <xsd:restriction base="dms:Text"/>
-      </xsd:simpleType>
-    </xsd:element>
-    <xsd:element name="ContentItem" ma:index="21" nillable="true" ma:displayName="Content Item" ma:default="" ma:hidden="true" ma:internalName="ContentItem" ma:readOnly="false">
+    <xsd:element name="_ApprovalStatus" ma:index="30" nillable="true" ma:displayName="Estado da aprovação" ma:internalName="_ApprovalStatus" ma:readOnly="true">
       <xsd:simpleType>
         <xsd:restriction base="dms:Unknown"/>
       </xsd:simpleType>
     </xsd:element>
-    <xsd:element name="CrawlForDependencies" ma:index="23" nillable="true" ma:displayName="Crawl for Dependencies?" ma:default="true" ma:internalName="CrawlForDependencies" ma:readOnly="false">
+    <xsd:element name="Guiadeservi_x00e7_o" ma:index="31" nillable="true" ma:displayName="Guia de serviço " ma:description="Hotel Histórico - Centro &#10;Hotel era uma mansão de um grande Duque &#10;&#10;Serviços básicos &#10;* Wi-fi &#10;* Ar condicionado &#10;* Televisão &#10;* Lavanderia &#10;* Recepção &#10;* Serviço de quarto &#10;* Concierge &#10;&#10;Serviço diferencial&#10;* Eventos imersivos simulando a época do estabelecimento -1 vez por semana, agendado na recepção ou reserva, parceria com o restaurante na recriação de um baile. &#10;* Visitas as dependências preservadas do hotel: escritório do duque, jardins, salas de jantar, alguns quartos - diariamente entre 13 às 17, agendamento mediante disponibilidade.&#10;* Menu inspirado nos ingredientes encontrados nesse período - todos os dias. &#10;* Passeio turístico pelos lugares históricos - Finais de semana , agendamento na recepção.&#10; &#10;Eduardo,Helena,Any" ma:format="Dropdown" ma:internalName="Guiadeservi_x00e7_o">
       <xsd:simpleType>
-        <xsd:restriction base="dms:Boolean"/>
+        <xsd:restriction base="dms:Text">
+          <xsd:maxLength value="255"/>
+        </xsd:restriction>
       </xsd:simpleType>
     </xsd:element>
-    <xsd:element name="CSXHash" ma:index="26" nillable="true" ma:displayName="CSX Hash" ma:default="" ma:indexed="true" ma:internalName="CSXHash" ma:readOnly="false">
+    <xsd:element name="entrevista" ma:index="32" nillable="true" ma:displayName="entrevista" ma:format="Dropdown" ma:internalName="entrevista">
       <xsd:simpleType>
-        <xsd:restriction base="dms:Text"/>
+        <xsd:restriction base="dms:Choice">
+          <xsd:enumeration value="1"/>
+          <xsd:enumeration value="2"/>
+          <xsd:enumeration value="3"/>
+          <xsd:enumeration value="4 ou mais"/>
+        </xsd:restriction>
       </xsd:simpleType>
     </xsd:element>
-    <xsd:element name="CSXSubmissionMarket" ma:index="27" nillable="true" ma:displayName="CSX Submission Market" ma:default="" ma:list="{2FBD1B11-2ACE-4FDC-B5A3-635D4ADF6F1B}" ma:internalName="CSXSubmissionMarket" ma:readOnly="false" ma:showField="MarketName" ma:web="4873beb7-5857-4685-be1f-d57550cc96cc">
-      <xsd:simpleType>
-        <xsd:restriction base="dms:Lookup"/>
-      </xsd:simpleType>
-    </xsd:element>
-    <xsd:element name="CSXUpdate" ma:index="28" nillable="true" ma:displayName="CSX Updated?" ma:default="false" ma:internalName="CSXUpdate" ma:readOnly="false">
-      <xsd:simpleType>
-        <xsd:restriction base="dms:Boolean"/>
-      </xsd:simpleType>
-    </xsd:element>
-    <xsd:element name="IntlLangReviewDate" ma:index="29" nillable="true" ma:displayName="Date to Complete Intl QA" ma:default="" ma:internalName="IntlLangReviewDate" ma:readOnly="false">
-      <xsd:simpleType>
-        <xsd:restriction base="dms:DateTime"/>
-      </xsd:simpleType>
-    </xsd:element>
-    <xsd:element name="IsDeleted" ma:index="30" nillable="true" ma:displayName="Deleted?" ma:default="" ma:internalName="IsDeleted" ma:readOnly="false">
-      <xsd:simpleType>
-        <xsd:restriction base="dms:Boolean"/>
-      </xsd:simpleType>
-    </xsd:element>
-    <xsd:element name="APDescription" ma:index="31" nillable="true" ma:displayName="Description" ma:default="" ma:internalName="APDescription" ma:readOnly="false">
-      <xsd:simpleType>
-        <xsd:restriction base="dms:Note"/>
-      </xsd:simpleType>
-    </xsd:element>
-    <xsd:element name="DirectSourceMarket" ma:index="32" nillable="true" ma:displayName="Direct Source Market Group" ma:default="" ma:internalName="DirectSourceMarket" ma:readOnly="false">
-      <xsd:simpleType>
-        <xsd:restriction base="dms:Text"/>
-      </xsd:simpleType>
-    </xsd:element>
-    <xsd:element name="Downloads" ma:index="33" nillable="true" ma:displayName="Downloads" ma:default="0" ma:hidden="true" ma:internalName="Downloads" ma:readOnly="false">
+    <xsd:element name="Eduarda_x002c_Lohanaevilma" ma:index="33" nillable="true" ma:displayName="Eduarda ,Lohana e vilma" ma:description="Tabelafluxo de atendimento via whatsapp aula 9" ma:format="Thumbnail" ma:internalName="Eduarda_x002c_Lohanaevilma">
       <xsd:simpleType>
         <xsd:restriction base="dms:Unknown"/>
       </xsd:simpleType>
     </xsd:element>
-    <xsd:element name="DSATActionTaken" ma:index="34" nillable="true" ma:displayName="DSAT Action Taken" ma:default="" ma:internalName="DSATActionTaken" ma:readOnly="false">
+    <xsd:element name="emmanuelG" ma:index="34" nillable="true" ma:displayName="emmanuel G" ma:format="Thumbnail" ma:internalName="emmanuelG">
       <xsd:simpleType>
-        <xsd:restriction base="dms:Choice">
-          <xsd:enumeration value="Best Bets"/>
-          <xsd:enumeration value="Expire"/>
-          <xsd:enumeration value="Hide"/>
-          <xsd:enumeration value="None"/>
+        <xsd:restriction base="dms:Unknown"/>
+      </xsd:simpleType>
+    </xsd:element>
+    <xsd:element name="Como_x0020_esse_x0020_problema_x0020_aparece_x0020_entre_x0020_os_x0020_jovens_x003f_" ma:index="35" ma:displayName="Como esse problema aparece entre os jovens?" ma:internalName="Como_x0020_esse_x0020_problema_x0020_aparece_x0020_entre_x0020_os_x0020_jovens_x003f_">
+      <xsd:simpleType>
+        <xsd:restriction base="dms:Note">
+          <xsd:maxLength value="255"/>
         </xsd:restriction>
       </xsd:simpleType>
     </xsd:element>
-    <xsd:element name="APEditor" ma:index="35" nillable="true" ma:displayName="Editor" ma:default="" ma:list="UserInfo" ma:internalName="APEditor" ma:readOnly="false">
+    <xsd:element name="Como_x0020_a_x0020_Sociologia_x0020_poderia_x0020_explicar_x0020_isso_x003f_" ma:index="36" ma:displayName="Como a Sociologia poderia explicar isso?" ma:internalName="Como_x0020_a_x0020_Sociologia_x0020_poderia_x0020_explicar_x0020_isso_x003f_">
+      <xsd:simpleType>
+        <xsd:restriction base="dms:Note">
+          <xsd:maxLength value="255"/>
+        </xsd:restriction>
+      </xsd:simpleType>
+    </xsd:element>
+    <xsd:element name="Nomes" ma:index="37" ma:displayName="Nomes" ma:internalName="Nomes">
+      <xsd:simpleType>
+        <xsd:restriction base="dms:Note">
+          <xsd:maxLength value="255"/>
+        </xsd:restriction>
+      </xsd:simpleType>
+    </xsd:element>
+    <xsd:element name="TEXTO_x002d_BASE_x0020_DO_x0020_ESTUDO" ma:index="38" nillable="true" ma:displayName="TEXTO-BASE DO ESTUDO" ma:internalName="TEXTO_x002d_BASE_x0020_DO_x0020_ESTUDO">
+      <xsd:simpleType>
+        <xsd:restriction base="dms:Text">
+          <xsd:maxLength value="255"/>
+        </xsd:restriction>
+      </xsd:simpleType>
+    </xsd:element>
+    <xsd:element name="Identifique_x0020_tr_x00ea_s_x0020_institui_x00e7__x00f5_es_x0020_sociais_x0020_presentes_x0020_no_x0020_caso_x0020_descrito_x0020_e_x0020_explique_x0020_brevemente_x0020_qual_x0020__x00e9__x0020_o_x0020_papel_x0020_de_x0020_cada_x0020_uma_x0020_na_x0020_organiza_x00e7__x00e3_o_x0020_da_x0020_vida_x0020_social_x002e_" ma:index="39" ma:displayName="Identifique três instituições sociais presentes no caso descrito e explique brevemente qual é o papel de cada uma na organização da vida social." ma:internalName="Identifique_x0020_tr_x00ea_s_x0020_institui_x00e7__x00f5_es_x0020_sociais_x0020_presentes_x0020_no_x0020_caso_x0020_descrito_x0020_e_x0020_explique_x0020_brevemente_x0020_qual_x0020__x00e9__x0020_o_x0020_papel_x0020_de_x0020_cada_x0020_uma_x0020_na_x0020_organiza_x00e7__x00e3_o_x0020_da_x0020_vida_x0020_social_x002e_">
+      <xsd:simpleType>
+        <xsd:restriction base="dms:Note">
+          <xsd:maxLength value="255"/>
+        </xsd:restriction>
+      </xsd:simpleType>
+    </xsd:element>
+    <xsd:element name="Explique_x002c__x0020_a_x0020_partir_x0020_do_x0020_texto_x002c__x0020_como_x0020_o_x0020_processo_x0020_de_x0020_socializa_x00e7__x00e3_o_x0020_contribui_x0020_para_x0020_que_x0020_Camila_x0020_consiga_x0020_agir_x0020_de_x0020_maneiras_x0020_diferentes_x0020_em_x0020_cada_x0020_ambiente_x0020_social_x002e_" ma:index="40" ma:displayName="Explique, a partir do texto, como o processo de socialização contribui para que Camila consiga agir de maneiras diferentes em cada ambiente social." ma:internalName="Explique_x002c__x0020_a_x0020_partir_x0020_do_x0020_texto_x002c__x0020_como_x0020_o_x0020_processo_x0020_de_x0020_socializa_x00e7__x00e3_o_x0020_contribui_x0020_para_x0020_que_x0020_Camila_x0020_consiga_x0020_agir_x0020_de_x0020_maneiras_x0020_diferentes_x0020_em_x0020_cada_x0020_ambiente_x0020_social_x002e_">
+      <xsd:simpleType>
+        <xsd:restriction base="dms:Note">
+          <xsd:maxLength value="255"/>
+        </xsd:restriction>
+      </xsd:simpleType>
+    </xsd:element>
+    <xsd:element name="No_x0020_texto_x002c__x0020_Camila_x0020_assume_x0020_a_x0020_fun_x00e7__x00e3_o_x0020_de_x0020_apresentar_x0020_o_x0020_trabalho_x0020_em_x0020_sala_x0020_de_x0020_aula_x002e__x0020_Explique_x0020_como_x0020_essa_x0020_situa_x00e7__x00e3_o_x0020_pode_x0020_ser_x0020_compreendida_x0020_a_x0020_partir_x0020_do_x0020_conceito_x0020_de_x0020_papel_x0020_social_x002e_" ma:index="41" ma:displayName="No texto, Camila assume a função de apresentar o trabalho em sala de aula. Explique como essa situação pode ser compreendida a partir do conceito de papel social." ma:internalName="No_x0020_texto_x002c__x0020_Camila_x0020_assume_x0020_a_x0020_fun_x00e7__x00e3_o_x0020_de_x0020_apresentar_x0020_o_x0020_trabalho_x0020_em_x0020_sala_x0020_de_x0020_aula_x002e__x0020_Explique_x0020_como_x0020_essa_x0020_situa_x00e7__x00e3_o_x0020_pode_x0020_ser_x0020_compreendida_x0020_a_x0020_partir_x0020_do_x0020_conceito_x0020_de_x0020_papel_x0020_social_x002e_">
+      <xsd:simpleType>
+        <xsd:restriction base="dms:Note">
+          <xsd:maxLength value="255"/>
+        </xsd:restriction>
+      </xsd:simpleType>
+    </xsd:element>
+    <xsd:element name="Explique_x0020_por_x0020_que_x0020_uma_x0020_mesma_x0020_pessoa_x0020_pode_x0020_desempenhar_x0020_v_x00e1_rios_x0020_pap_x00e9_is_x0020_sociais_x0020_diferentes_x0020_ao_x0020_longo_x0020_de_x0020_um_x0020_mesmo_x0020_dia_x002e_" ma:index="42" ma:displayName="Explique por que uma mesma pessoa pode desempenhar vários papéis sociais diferentes ao longo de um mesmo dia." ma:internalName="Explique_x0020_por_x0020_que_x0020_uma_x0020_mesma_x0020_pessoa_x0020_pode_x0020_desempenhar_x0020_v_x00e1_rios_x0020_pap_x00e9_is_x0020_sociais_x0020_diferentes_x0020_ao_x0020_longo_x0020_de_x0020_um_x0020_mesmo_x0020_dia_x002e_">
+      <xsd:simpleType>
+        <xsd:restriction base="dms:Note">
+          <xsd:maxLength value="255"/>
+        </xsd:restriction>
+      </xsd:simpleType>
+    </xsd:element>
+    <xsd:element name="A_x0020_partir_x0020_das_x0020_ideias_x0020_de_x0020_Erving_x0020_Goffman_x002c__x0020_explique_x0020_por_x0020_que_x0020_Camila_x0020_controla_x0020_sua_x0020_forma_x0020_de_x0020_falar_x0020_e_x0020_de_x0020_se_x0020_comportar_x0020_em_x0020_determinados_x0020_contextos_x0020_sociais_x002e_" ma:index="43" ma:displayName="A partir das ideias de Erving Goffman, explique por que Camila controla sua forma de falar e de se comportar em determinados contextos sociais." ma:internalName="A_x0020_partir_x0020_das_x0020_ideias_x0020_de_x0020_Erving_x0020_Goffman_x002c__x0020_explique_x0020_por_x0020_que_x0020_Camila_x0020_controla_x0020_sua_x0020_forma_x0020_de_x0020_falar_x0020_e_x0020_de_x0020_se_x0020_comportar_x0020_em_x0020_determinados_x0020_contextos_x0020_sociais_x002e_">
+      <xsd:simpleType>
+        <xsd:restriction base="dms:Note">
+          <xsd:maxLength value="255"/>
+        </xsd:restriction>
+      </xsd:simpleType>
+    </xsd:element>
+    <xsd:element name="Utilizando_x0020_o_x0020_conceito_x0020_de_x0020_apresenta_x00e7__x00e3_o_x0020_de_x0020_si_x002c__x0020_explique_x0020_como_x0020_o_x0020_comportamento_x0020_de_x0020_Camila_x0020_no_x0020_ambiente_x0020_de_x0020_trabalho_x0020_pode_x0020_ser_x0020_interpretado_x0020_sociologicamente_x002e_" ma:index="44" ma:displayName="Utilizando o conceito de apresentação de si, explique como o comportamento de Camila no ambiente de trabalho pode ser interpretado sociologicamente." ma:internalName="Utilizando_x0020_o_x0020_conceito_x0020_de_x0020_apresenta_x00e7__x00e3_o_x0020_de_x0020_si_x002c__x0020_explique_x0020_como_x0020_o_x0020_comportamento_x0020_de_x0020_Camila_x0020_no_x0020_ambiente_x0020_de_x0020_trabalho_x0020_pode_x0020_ser_x0020_interpretado_x0020_sociologicamente_x002e_">
+      <xsd:simpleType>
+        <xsd:restriction base="dms:Note">
+          <xsd:maxLength value="255"/>
+        </xsd:restriction>
+      </xsd:simpleType>
+    </xsd:element>
+    <xsd:element name="Explique_x0020_a_x0020_rela_x00e7__x00e3_o_x0020_entre_x0020_institui_x00e7__x00f5_es_x0020_sociais_x0020_e_x0020_processos_x0020_de_x0020_socializa_x00e7__x00e3_o_x0020_na_x0020_forma_x00e7__x00e3_o_x0020_dos_x0020_comportamentos_x0020_observados_x0020_no_x0020_texto_x002e_" ma:index="45" ma:displayName="Explique a relação entre instituições sociais e processos de socialização na formação dos comportamentos observados no texto." ma:internalName="Explique_x0020_a_x0020_rela_x00e7__x00e3_o_x0020_entre_x0020_institui_x00e7__x00f5_es_x0020_sociais_x0020_e_x0020_processos_x0020_de_x0020_socializa_x00e7__x00e3_o_x0020_na_x0020_forma_x00e7__x00e3_o_x0020_dos_x0020_comportamentos_x0020_observados_x0020_no_x0020_texto_x002e_">
+      <xsd:simpleType>
+        <xsd:restriction base="dms:Note">
+          <xsd:maxLength value="255"/>
+        </xsd:restriction>
+      </xsd:simpleType>
+    </xsd:element>
+    <xsd:element name="O_x0020_caso_x0020_apresentado_x0020_mostra_x0020_que_x0020_diferentes_x0020_ambientes_x0020_possuem_x0020_normas_x0020_e_x0020_expectativas_x0020_espec_x00ed_ficas_x002e__x0020_Explique_x0020_por_x0020_que_x0020_a_x0020_exist_x00ea_ncia_x0020_dessas_x0020_normas_x0020__x00e9__x0020_importante_x0020_para_x0020_o_x0020_funcionamento_x0020_da_x0020_vida_x0020_social_x002e_" ma:index="46" ma:displayName="O caso apresentado mostra que diferentes ambientes possuem normas e expectativas específicas. Explique por que a existência dessas normas é importante para o funcionamento da vida social." ma:internalName="O_x0020_caso_x0020_apresentado_x0020_mostra_x0020_que_x0020_diferentes_x0020_ambientes_x0020_possuem_x0020_normas_x0020_e_x0020_expectativas_x0020_espec_x00ed_ficas_x002e__x0020_Explique_x0020_por_x0020_que_x0020_a_x0020_exist_x00ea_ncia_x0020_dessas_x0020_normas_x0020__x00e9__x0020_importante_x0020_para_x0020_o_x0020_funcionamento_x0020_da_x0020_vida_x0020_social_x002e_">
+      <xsd:simpleType>
+        <xsd:restriction base="dms:Note">
+          <xsd:maxLength value="255"/>
+        </xsd:restriction>
+      </xsd:simpleType>
+    </xsd:element>
+    <xsd:element name="A_x0020_partir_x0020_do_x0020_caso_x0020_analisado_x002c__x0020_explique_x0020_como_x0020_os_x0020_conceitos_x0020_de_x0020_institui_x00e7__x00e3_o_x0020_social_x002c__x0020_socializa_x00e7__x00e3_o_x0020_e_x0020_papel_x0020_social_x0020_est_x00e3_o_x0020_interligados_x002e_" ma:index="47" ma:displayName="A partir do caso analisado, explique como os conceitos de instituição social, socialização e papel social estão interligados." ma:internalName="A_x0020_partir_x0020_do_x0020_caso_x0020_analisado_x002c__x0020_explique_x0020_como_x0020_os_x0020_conceitos_x0020_de_x0020_institui_x00e7__x00e3_o_x0020_social_x002c__x0020_socializa_x00e7__x00e3_o_x0020_e_x0020_papel_x0020_social_x0020_est_x00e3_o_x0020_interligados_x002e_">
+      <xsd:simpleType>
+        <xsd:restriction base="dms:Note">
+          <xsd:maxLength value="255"/>
+        </xsd:restriction>
+      </xsd:simpleType>
+    </xsd:element>
+  </xsd:schema>
+  <xsd:schema xmlns:xsd="http://www.w3.org/2001/XMLSchema" xmlns:xs="http://www.w3.org/2001/XMLSchema" xmlns:dms="http://schemas.microsoft.com/office/2006/documentManagement/types" xmlns:pc="http://schemas.microsoft.com/office/infopath/2007/PartnerControls" targetNamespace="29c85e31-c0e5-4fba-ab60-4fce8ca17cbc" elementFormDefault="qualified">
+    <xsd:import namespace="http://schemas.microsoft.com/office/2006/documentManagement/types"/>
+    <xsd:import namespace="http://schemas.microsoft.com/office/infopath/2007/PartnerControls"/>
+    <xsd:element name="SharedWithUsers" ma:index="8" nillable="true" ma:displayName="Compartilhado com" ma:hidden="true" ma:internalName="SharedWithUsers" ma:readOnly="true">
       <xsd:complexType>
         <xsd:complexContent>
-          <xsd:extension base="dms:User">
+          <xsd:extension base="dms:UserMulti">
             <xsd:sequence>
               <xsd:element name="UserInfo" minOccurs="0" maxOccurs="unbounded">
                 <xsd:complexType>
@@ -28329,49 +28321,12 @@
         </xsd:complexContent>
       </xsd:complexType>
     </xsd:element>
-    <xsd:element name="EditorialStatus" ma:index="36" nillable="true" ma:displayName="Editorial Status" ma:default="" ma:internalName="EditorialStatus" ma:readOnly="false">
+    <xsd:element name="SharedWithDetails" ma:index="9" nillable="true" ma:displayName="Detalhes de Compartilhado Com" ma:hidden="true" ma:internalName="SharedWithDetails" ma:readOnly="true">
       <xsd:simpleType>
-        <xsd:restriction base="dms:Unknown"/>
+        <xsd:restriction base="dms:Note"/>
       </xsd:simpleType>
     </xsd:element>
-    <xsd:element name="EditorialTags" ma:index="37" nillable="true" ma:displayName="Editorial Tags" ma:default="" ma:internalName="EditorialTags">
-      <xsd:simpleType>
-        <xsd:restriction base="dms:Unknown"/>
-      </xsd:simpleType>
-    </xsd:element>
-    <xsd:element name="TPExecutable" ma:index="38" nillable="true" ma:displayName="Executable" ma:default="" ma:internalName="TPExecutable">
-      <xsd:simpleType>
-        <xsd:restriction base="dms:Text"/>
-      </xsd:simpleType>
-    </xsd:element>
-    <xsd:element name="FeatureTagsTaxHTField0" ma:index="40" nillable="true" ma:taxonomy="true" ma:internalName="FeatureTagsTaxHTField0" ma:taxonomyFieldName="FeatureTags" ma:displayName="Features" ma:readOnly="false" ma:default="" ma:fieldId="{7fc0d542-15c6-4882-a8e3-13bca44403fb}" ma:taxonomyMulti="true" ma:sspId="8f79753a-75d3-41f5-8ca3-40b843941b4f" ma:termSetId="f1ab6845-967d-4854-a0ba-4ec07f0f8113" ma:anchorId="00000000-0000-0000-0000-000000000000" ma:open="false" ma:isKeyword="false">
-      <xsd:complexType>
-        <xsd:sequence>
-          <xsd:element ref="pc:Terms" minOccurs="0" maxOccurs="1"/>
-        </xsd:sequence>
-      </xsd:complexType>
-    </xsd:element>
-    <xsd:element name="TPFriendlyName" ma:index="41" nillable="true" ma:displayName="Friendly Name" ma:default="" ma:internalName="TPFriendlyName">
-      <xsd:simpleType>
-        <xsd:restriction base="dms:Text"/>
-      </xsd:simpleType>
-    </xsd:element>
-    <xsd:element name="FriendlyTitle" ma:index="42" nillable="true" ma:displayName="Friendly Title" ma:default="" ma:description="Shorter title to be used when displaying search results" ma:internalName="FriendlyTitle" ma:readOnly="false">
-      <xsd:simpleType>
-        <xsd:restriction base="dms:Text"/>
-      </xsd:simpleType>
-    </xsd:element>
-    <xsd:element name="PrimaryImageGen" ma:index="43" nillable="true" ma:displayName="Generate Images?" ma:default="true" ma:internalName="PrimaryImageGen">
-      <xsd:simpleType>
-        <xsd:restriction base="dms:Boolean"/>
-      </xsd:simpleType>
-    </xsd:element>
-    <xsd:element name="HandoffToMSDN" ma:index="44" nillable="true" ma:displayName="Handoff To MSDN Date" ma:default="" ma:internalName="HandoffToMSDN" ma:readOnly="false">
-      <xsd:simpleType>
-        <xsd:restriction base="dms:DateTime"/>
-      </xsd:simpleType>
-    </xsd:element>
-    <xsd:element name="InProjectListLookup" ma:index="45" nillable="true" ma:displayName="InProjectListLookup" ma:list="{9E343742-310B-4684-A24C-1D137CB4B230}" ma:internalName="InProjectListLookup" ma:readOnly="true" ma:showField="InProjectList" ma:web="4873beb7-5857-4685-be1f-d57550cc96cc">
+    <xsd:element name="TaxCatchAll" ma:index="20" nillable="true" ma:displayName="Taxonomy Catch All Column" ma:hidden="true" ma:list="{70672001-ba53-4cf3-bc98-583cff500914}" ma:internalName="TaxCatchAll" ma:readOnly="false" ma:showField="CatchAllData" ma:web="29c85e31-c0e5-4fba-ab60-4fce8ca17cbc">
       <xsd:complexType>
         <xsd:complexContent>
           <xsd:extension base="dms:MultiChoiceLookup">
@@ -28381,543 +28336,6 @@
           </xsd:extension>
         </xsd:complexContent>
       </xsd:complexType>
-    </xsd:element>
-    <xsd:element name="TPInstallLocation" ma:index="46" nillable="true" ma:displayName="Install Location" ma:default="" ma:internalName="TPInstallLocation">
-      <xsd:simpleType>
-        <xsd:restriction base="dms:Text"/>
-      </xsd:simpleType>
-    </xsd:element>
-    <xsd:element name="InternalTagsTaxHTField0" ma:index="48" nillable="true" ma:taxonomy="true" ma:internalName="InternalTagsTaxHTField0" ma:taxonomyFieldName="InternalTags" ma:displayName="Internal Tags" ma:readOnly="false" ma:default="" ma:fieldId="{1490b8a4-2706-41ec-b5e3-73176dccf34e}" ma:taxonomyMulti="true" ma:sspId="8f79753a-75d3-41f5-8ca3-40b843941b4f" ma:termSetId="82b6639e-f7fc-4c18-ad2d-003a6e707765" ma:anchorId="00000000-0000-0000-0000-000000000000" ma:open="false" ma:isKeyword="false">
-      <xsd:complexType>
-        <xsd:sequence>
-          <xsd:element ref="pc:Terms" minOccurs="0" maxOccurs="1"/>
-        </xsd:sequence>
-      </xsd:complexType>
-    </xsd:element>
-    <xsd:element name="IntlLangReview" ma:index="49" nillable="true" ma:displayName="Intl Lang QA Review Required?" ma:default="" ma:internalName="IntlLangReview" ma:readOnly="false">
-      <xsd:simpleType>
-        <xsd:restriction base="dms:Boolean"/>
-      </xsd:simpleType>
-    </xsd:element>
-    <xsd:element name="IntlLangReviewer" ma:index="50" nillable="true" ma:displayName="Intl Lang QA Reviewer" ma:default="" ma:internalName="IntlLangReviewer" ma:readOnly="false">
-      <xsd:simpleType>
-        <xsd:restriction base="dms:Text"/>
-      </xsd:simpleType>
-    </xsd:element>
-    <xsd:element name="MarketSpecific" ma:index="51" nillable="true" ma:displayName="Is Market Specific?" ma:default="" ma:internalName="MarketSpecific" ma:readOnly="false">
-      <xsd:simpleType>
-        <xsd:restriction base="dms:Boolean"/>
-      </xsd:simpleType>
-    </xsd:element>
-    <xsd:element name="LastCompleteVersionLookup" ma:index="52" nillable="true" ma:displayName="Last Complete Version Lookup" ma:default="" ma:list="{9E343742-310B-4684-A24C-1D137CB4B230}" ma:internalName="LastCompleteVersionLookup" ma:readOnly="true" ma:showField="LastCompleteVersion" ma:web="4873beb7-5857-4685-be1f-d57550cc96cc">
-      <xsd:complexType>
-        <xsd:complexContent>
-          <xsd:extension base="dms:MultiChoiceLookup">
-            <xsd:sequence>
-              <xsd:element name="Value" type="dms:Lookup" maxOccurs="unbounded" minOccurs="0" nillable="true"/>
-            </xsd:sequence>
-          </xsd:extension>
-        </xsd:complexContent>
-      </xsd:complexType>
-    </xsd:element>
-    <xsd:element name="LastHandOff" ma:index="53" nillable="true" ma:displayName="Last Hand-off" ma:default="" ma:internalName="LastHandOff" ma:readOnly="false">
-      <xsd:simpleType>
-        <xsd:restriction base="dms:DateTime"/>
-      </xsd:simpleType>
-    </xsd:element>
-    <xsd:element name="LastModifiedDateTime" ma:index="54" nillable="true" ma:displayName="Last Modified Date" ma:default="" ma:internalName="LastModifiedDateTime" ma:readOnly="false">
-      <xsd:simpleType>
-        <xsd:restriction base="dms:DateTime"/>
-      </xsd:simpleType>
-    </xsd:element>
-    <xsd:element name="LastPreviewErrorLookup" ma:index="55" nillable="true" ma:displayName="Last Preview Attempt Error" ma:default="" ma:list="{9E343742-310B-4684-A24C-1D137CB4B230}" ma:internalName="LastPreviewErrorLookup" ma:readOnly="true" ma:showField="LastPreviewError" ma:web="4873beb7-5857-4685-be1f-d57550cc96cc">
-      <xsd:complexType>
-        <xsd:complexContent>
-          <xsd:extension base="dms:MultiChoiceLookup">
-            <xsd:sequence>
-              <xsd:element name="Value" type="dms:Lookup" maxOccurs="unbounded" minOccurs="0" nillable="true"/>
-            </xsd:sequence>
-          </xsd:extension>
-        </xsd:complexContent>
-      </xsd:complexType>
-    </xsd:element>
-    <xsd:element name="LastPreviewResultLookup" ma:index="56" nillable="true" ma:displayName="Last Preview Attempt Result" ma:default="" ma:list="{9E343742-310B-4684-A24C-1D137CB4B230}" ma:internalName="LastPreviewResultLookup" ma:readOnly="true" ma:showField="LastPreviewResult" ma:web="4873beb7-5857-4685-be1f-d57550cc96cc">
-      <xsd:complexType>
-        <xsd:complexContent>
-          <xsd:extension base="dms:MultiChoiceLookup">
-            <xsd:sequence>
-              <xsd:element name="Value" type="dms:Lookup" maxOccurs="unbounded" minOccurs="0" nillable="true"/>
-            </xsd:sequence>
-          </xsd:extension>
-        </xsd:complexContent>
-      </xsd:complexType>
-    </xsd:element>
-    <xsd:element name="LastPreviewAttemptDateLookup" ma:index="57" nillable="true" ma:displayName="Last Preview Attempted On" ma:default="" ma:list="{9E343742-310B-4684-A24C-1D137CB4B230}" ma:internalName="LastPreviewAttemptDateLookup" ma:readOnly="true" ma:showField="LastPreviewAttemptDate" ma:web="4873beb7-5857-4685-be1f-d57550cc96cc">
-      <xsd:complexType>
-        <xsd:complexContent>
-          <xsd:extension base="dms:MultiChoiceLookup">
-            <xsd:sequence>
-              <xsd:element name="Value" type="dms:Lookup" maxOccurs="unbounded" minOccurs="0" nillable="true"/>
-            </xsd:sequence>
-          </xsd:extension>
-        </xsd:complexContent>
-      </xsd:complexType>
-    </xsd:element>
-    <xsd:element name="LastPreviewedByLookup" ma:index="58" nillable="true" ma:displayName="Last Previewed By" ma:default="" ma:list="{9E343742-310B-4684-A24C-1D137CB4B230}" ma:internalName="LastPreviewedByLookup" ma:readOnly="true" ma:showField="LastPreviewedBy" ma:web="4873beb7-5857-4685-be1f-d57550cc96cc">
-      <xsd:complexType>
-        <xsd:complexContent>
-          <xsd:extension base="dms:MultiChoiceLookup">
-            <xsd:sequence>
-              <xsd:element name="Value" type="dms:Lookup" maxOccurs="unbounded" minOccurs="0" nillable="true"/>
-            </xsd:sequence>
-          </xsd:extension>
-        </xsd:complexContent>
-      </xsd:complexType>
-    </xsd:element>
-    <xsd:element name="LastPreviewTimeLookup" ma:index="59" nillable="true" ma:displayName="Last Previewed Date" ma:default="" ma:list="{9E343742-310B-4684-A24C-1D137CB4B230}" ma:internalName="LastPreviewTimeLookup" ma:readOnly="true" ma:showField="LastPreviewTime" ma:web="4873beb7-5857-4685-be1f-d57550cc96cc">
-      <xsd:complexType>
-        <xsd:complexContent>
-          <xsd:extension base="dms:MultiChoiceLookup">
-            <xsd:sequence>
-              <xsd:element name="Value" type="dms:Lookup" maxOccurs="unbounded" minOccurs="0" nillable="true"/>
-            </xsd:sequence>
-          </xsd:extension>
-        </xsd:complexContent>
-      </xsd:complexType>
-    </xsd:element>
-    <xsd:element name="LastPreviewVersionLookup" ma:index="60" nillable="true" ma:displayName="Last Previewed Version" ma:default="" ma:list="{9E343742-310B-4684-A24C-1D137CB4B230}" ma:internalName="LastPreviewVersionLookup" ma:readOnly="true" ma:showField="LastPreviewVersion" ma:web="4873beb7-5857-4685-be1f-d57550cc96cc">
-      <xsd:complexType>
-        <xsd:complexContent>
-          <xsd:extension base="dms:MultiChoiceLookup">
-            <xsd:sequence>
-              <xsd:element name="Value" type="dms:Lookup" maxOccurs="unbounded" minOccurs="0" nillable="true"/>
-            </xsd:sequence>
-          </xsd:extension>
-        </xsd:complexContent>
-      </xsd:complexType>
-    </xsd:element>
-    <xsd:element name="LastPublishErrorLookup" ma:index="61" nillable="true" ma:displayName="Last Publish Attempt Error" ma:default="" ma:list="{9E343742-310B-4684-A24C-1D137CB4B230}" ma:internalName="LastPublishErrorLookup" ma:readOnly="true" ma:showField="LastPublishError" ma:web="4873beb7-5857-4685-be1f-d57550cc96cc">
-      <xsd:complexType>
-        <xsd:complexContent>
-          <xsd:extension base="dms:MultiChoiceLookup">
-            <xsd:sequence>
-              <xsd:element name="Value" type="dms:Lookup" maxOccurs="unbounded" minOccurs="0" nillable="true"/>
-            </xsd:sequence>
-          </xsd:extension>
-        </xsd:complexContent>
-      </xsd:complexType>
-    </xsd:element>
-    <xsd:element name="LastPublishResultLookup" ma:index="62" nillable="true" ma:displayName="Last Publish Attempt Result" ma:default="" ma:list="{9E343742-310B-4684-A24C-1D137CB4B230}" ma:internalName="LastPublishResultLookup" ma:readOnly="true" ma:showField="LastPublishResult" ma:web="4873beb7-5857-4685-be1f-d57550cc96cc">
-      <xsd:complexType>
-        <xsd:complexContent>
-          <xsd:extension base="dms:MultiChoiceLookup">
-            <xsd:sequence>
-              <xsd:element name="Value" type="dms:Lookup" maxOccurs="unbounded" minOccurs="0" nillable="true"/>
-            </xsd:sequence>
-          </xsd:extension>
-        </xsd:complexContent>
-      </xsd:complexType>
-    </xsd:element>
-    <xsd:element name="LastPublishAttemptDateLookup" ma:index="63" nillable="true" ma:displayName="Last Publish Attempted On" ma:default="" ma:list="{9E343742-310B-4684-A24C-1D137CB4B230}" ma:internalName="LastPublishAttemptDateLookup" ma:readOnly="true" ma:showField="LastPublishAttemptDate" ma:web="4873beb7-5857-4685-be1f-d57550cc96cc">
-      <xsd:complexType>
-        <xsd:complexContent>
-          <xsd:extension base="dms:MultiChoiceLookup">
-            <xsd:sequence>
-              <xsd:element name="Value" type="dms:Lookup" maxOccurs="unbounded" minOccurs="0" nillable="true"/>
-            </xsd:sequence>
-          </xsd:extension>
-        </xsd:complexContent>
-      </xsd:complexType>
-    </xsd:element>
-    <xsd:element name="LastPublishedByLookup" ma:index="64" nillable="true" ma:displayName="Last Published By" ma:default="" ma:list="{9E343742-310B-4684-A24C-1D137CB4B230}" ma:internalName="LastPublishedByLookup" ma:readOnly="true" ma:showField="LastPublishedBy" ma:web="4873beb7-5857-4685-be1f-d57550cc96cc">
-      <xsd:complexType>
-        <xsd:complexContent>
-          <xsd:extension base="dms:MultiChoiceLookup">
-            <xsd:sequence>
-              <xsd:element name="Value" type="dms:Lookup" maxOccurs="unbounded" minOccurs="0" nillable="true"/>
-            </xsd:sequence>
-          </xsd:extension>
-        </xsd:complexContent>
-      </xsd:complexType>
-    </xsd:element>
-    <xsd:element name="LastPublishTimeLookup" ma:index="65" nillable="true" ma:displayName="Last Published Date" ma:default="" ma:list="{9E343742-310B-4684-A24C-1D137CB4B230}" ma:internalName="LastPublishTimeLookup" ma:readOnly="true" ma:showField="LastPublishTime" ma:web="4873beb7-5857-4685-be1f-d57550cc96cc">
-      <xsd:complexType>
-        <xsd:complexContent>
-          <xsd:extension base="dms:MultiChoiceLookup">
-            <xsd:sequence>
-              <xsd:element name="Value" type="dms:Lookup" maxOccurs="unbounded" minOccurs="0" nillable="true"/>
-            </xsd:sequence>
-          </xsd:extension>
-        </xsd:complexContent>
-      </xsd:complexType>
-    </xsd:element>
-    <xsd:element name="LastPublishVersionLookup" ma:index="66" nillable="true" ma:displayName="Last Published Version" ma:default="" ma:list="{9E343742-310B-4684-A24C-1D137CB4B230}" ma:internalName="LastPublishVersionLookup" ma:readOnly="true" ma:showField="LastPublishVersion" ma:web="4873beb7-5857-4685-be1f-d57550cc96cc">
-      <xsd:complexType>
-        <xsd:complexContent>
-          <xsd:extension base="dms:MultiChoiceLookup">
-            <xsd:sequence>
-              <xsd:element name="Value" type="dms:Lookup" maxOccurs="unbounded" minOccurs="0" nillable="true"/>
-            </xsd:sequence>
-          </xsd:extension>
-        </xsd:complexContent>
-      </xsd:complexType>
-    </xsd:element>
-    <xsd:element name="TPLaunchHelpLinkType" ma:index="67" nillable="true" ma:displayName="Launch Help Link Type" ma:default="Template" ma:internalName="TPLaunchHelpLinkType">
-      <xsd:simpleType>
-        <xsd:restriction base="dms:Choice">
-          <xsd:enumeration value="Template"/>
-          <xsd:enumeration value="Training"/>
-          <xsd:enumeration value="URL"/>
-          <xsd:enumeration value="None"/>
-        </xsd:restriction>
-      </xsd:simpleType>
-    </xsd:element>
-    <xsd:element name="LegacyData" ma:index="68" nillable="true" ma:displayName="Legacy Data" ma:default="" ma:internalName="LegacyData" ma:readOnly="false">
-      <xsd:simpleType>
-        <xsd:restriction base="dms:Note"/>
-      </xsd:simpleType>
-    </xsd:element>
-    <xsd:element name="TPLaunchHelpLink" ma:index="69" nillable="true" ma:displayName="Link to Launch Help Topic" ma:default="" ma:internalName="TPLaunchHelpLink">
-      <xsd:simpleType>
-        <xsd:restriction base="dms:Text"/>
-      </xsd:simpleType>
-    </xsd:element>
-    <xsd:element name="LocComments" ma:index="70" nillable="true" ma:displayName="Loc Approval Comments" ma:default="" ma:internalName="LocComments" ma:readOnly="false">
-      <xsd:simpleType>
-        <xsd:restriction base="dms:Note"/>
-      </xsd:simpleType>
-    </xsd:element>
-    <xsd:element name="LocLastLocAttemptVersionLookup" ma:index="71" nillable="true" ma:displayName="Loc Last Loc Attempt Version" ma:default="" ma:list="{7DD1DCEC-E449-43D3-891F-7DC62F62AD21}" ma:internalName="LocLastLocAttemptVersionLookup" ma:readOnly="false" ma:showField="LastLocAttemptVersion" ma:web="4873beb7-5857-4685-be1f-d57550cc96cc">
-      <xsd:simpleType>
-        <xsd:restriction base="dms:Lookup"/>
-      </xsd:simpleType>
-    </xsd:element>
-    <xsd:element name="LocLastLocAttemptVersionTypeLookup" ma:index="72" nillable="true" ma:displayName="Loc Last Loc Attempt Version Type" ma:default="" ma:list="{7DD1DCEC-E449-43D3-891F-7DC62F62AD21}" ma:internalName="LocLastLocAttemptVersionTypeLookup" ma:readOnly="true" ma:showField="LastLocAttemptVersionType" ma:web="4873beb7-5857-4685-be1f-d57550cc96cc">
-      <xsd:simpleType>
-        <xsd:restriction base="dms:Lookup"/>
-      </xsd:simpleType>
-    </xsd:element>
-    <xsd:element name="LocManualTestRequired" ma:index="73" nillable="true" ma:displayName="Loc Manual Test Required" ma:default="" ma:internalName="LocManualTestRequired" ma:readOnly="false">
-      <xsd:simpleType>
-        <xsd:restriction base="dms:Boolean"/>
-      </xsd:simpleType>
-    </xsd:element>
-    <xsd:element name="LocMarketGroupTiers2" ma:index="74" nillable="true" ma:displayName="Loc Market Group Tiers" ma:internalName="LocMarketGroupTiers2" ma:readOnly="false">
-      <xsd:simpleType>
-        <xsd:restriction base="dms:Unknown"/>
-      </xsd:simpleType>
-    </xsd:element>
-    <xsd:element name="LocNewPublishedVersionLookup" ma:index="75" nillable="true" ma:displayName="Loc New Published Version Lookup" ma:default="" ma:list="{7DD1DCEC-E449-43D3-891F-7DC62F62AD21}" ma:internalName="LocNewPublishedVersionLookup" ma:readOnly="true" ma:showField="NewPublishedVersion" ma:web="4873beb7-5857-4685-be1f-d57550cc96cc">
-      <xsd:simpleType>
-        <xsd:restriction base="dms:Lookup"/>
-      </xsd:simpleType>
-    </xsd:element>
-    <xsd:element name="LocOverallHandbackStatusLookup" ma:index="76" nillable="true" ma:displayName="Loc Overall Handback Status" ma:default="" ma:list="{7DD1DCEC-E449-43D3-891F-7DC62F62AD21}" ma:internalName="LocOverallHandbackStatusLookup" ma:readOnly="true" ma:showField="OverallHandbackStatus" ma:web="4873beb7-5857-4685-be1f-d57550cc96cc">
-      <xsd:simpleType>
-        <xsd:restriction base="dms:Lookup"/>
-      </xsd:simpleType>
-    </xsd:element>
-    <xsd:element name="LocOverallLocStatusLookup" ma:index="77" nillable="true" ma:displayName="Loc Overall Localize Status" ma:default="" ma:list="{7DD1DCEC-E449-43D3-891F-7DC62F62AD21}" ma:internalName="LocOverallLocStatusLookup" ma:readOnly="true" ma:showField="OverallLocStatus" ma:web="4873beb7-5857-4685-be1f-d57550cc96cc">
-      <xsd:simpleType>
-        <xsd:restriction base="dms:Lookup"/>
-      </xsd:simpleType>
-    </xsd:element>
-    <xsd:element name="LocOverallPreviewStatusLookup" ma:index="78" nillable="true" ma:displayName="Loc Overall Preview Status" ma:default="" ma:list="{7DD1DCEC-E449-43D3-891F-7DC62F62AD21}" ma:internalName="LocOverallPreviewStatusLookup" ma:readOnly="true" ma:showField="OverallPreviewStatus" ma:web="4873beb7-5857-4685-be1f-d57550cc96cc">
-      <xsd:simpleType>
-        <xsd:restriction base="dms:Lookup"/>
-      </xsd:simpleType>
-    </xsd:element>
-    <xsd:element name="LocOverallPublishStatusLookup" ma:index="79" nillable="true" ma:displayName="Loc Overall Publish Status" ma:default="" ma:list="{7DD1DCEC-E449-43D3-891F-7DC62F62AD21}" ma:internalName="LocOverallPublishStatusLookup" ma:readOnly="true" ma:showField="OverallPublishStatus" ma:web="4873beb7-5857-4685-be1f-d57550cc96cc">
-      <xsd:simpleType>
-        <xsd:restriction base="dms:Lookup"/>
-      </xsd:simpleType>
-    </xsd:element>
-    <xsd:element name="IntlLocPriority" ma:index="80" nillable="true" ma:displayName="Loc Priority" ma:default="" ma:internalName="IntlLocPriority" ma:readOnly="false">
-      <xsd:simpleType>
-        <xsd:restriction base="dms:Unknown"/>
-      </xsd:simpleType>
-    </xsd:element>
-    <xsd:element name="LocProcessedForHandoffsLookup" ma:index="81" nillable="true" ma:displayName="Loc Processed For Handoffs" ma:default="" ma:list="{7DD1DCEC-E449-43D3-891F-7DC62F62AD21}" ma:internalName="LocProcessedForHandoffsLookup" ma:readOnly="true" ma:showField="ProcessedForHandoffs" ma:web="4873beb7-5857-4685-be1f-d57550cc96cc">
-      <xsd:simpleType>
-        <xsd:restriction base="dms:Lookup"/>
-      </xsd:simpleType>
-    </xsd:element>
-    <xsd:element name="LocProcessedForMarketsLookup" ma:index="82" nillable="true" ma:displayName="Loc Processed For Markets" ma:default="" ma:list="{7DD1DCEC-E449-43D3-891F-7DC62F62AD21}" ma:internalName="LocProcessedForMarketsLookup" ma:readOnly="true" ma:showField="ProcessedForMarkets" ma:web="4873beb7-5857-4685-be1f-d57550cc96cc">
-      <xsd:simpleType>
-        <xsd:restriction base="dms:Lookup"/>
-      </xsd:simpleType>
-    </xsd:element>
-    <xsd:element name="LocPublishedDependentAssetsLookup" ma:index="83" nillable="true" ma:displayName="Loc Published Dependent Assets" ma:default="" ma:list="{7DD1DCEC-E449-43D3-891F-7DC62F62AD21}" ma:internalName="LocPublishedDependentAssetsLookup" ma:readOnly="true" ma:showField="PublishedDependentAssets" ma:web="4873beb7-5857-4685-be1f-d57550cc96cc">
-      <xsd:simpleType>
-        <xsd:restriction base="dms:Lookup"/>
-      </xsd:simpleType>
-    </xsd:element>
-    <xsd:element name="LocPublishedLinkedAssetsLookup" ma:index="84" nillable="true" ma:displayName="Loc Published Linked Assets" ma:default="" ma:list="{7DD1DCEC-E449-43D3-891F-7DC62F62AD21}" ma:internalName="LocPublishedLinkedAssetsLookup" ma:readOnly="true" ma:showField="PublishedLinkedAssets" ma:web="4873beb7-5857-4685-be1f-d57550cc96cc">
-      <xsd:simpleType>
-        <xsd:restriction base="dms:Lookup"/>
-      </xsd:simpleType>
-    </xsd:element>
-    <xsd:element name="LocRecommendedHandoff" ma:index="85" nillable="true" ma:displayName="Loc Recommended Handoff" ma:default="" ma:indexed="true" ma:internalName="LocRecommendedHandoff" ma:readOnly="false">
-      <xsd:simpleType>
-        <xsd:restriction base="dms:Text"/>
-      </xsd:simpleType>
-    </xsd:element>
-    <xsd:element name="LocalizationTagsTaxHTField0" ma:index="87" nillable="true" ma:taxonomy="true" ma:internalName="LocalizationTagsTaxHTField0" ma:taxonomyFieldName="LocalizationTags" ma:displayName="Localization Tags" ma:readOnly="false" ma:default="" ma:fieldId="{00f02cb3-2c7c-424a-9c61-10e9b6878429}" ma:taxonomyMulti="true" ma:sspId="8f79753a-75d3-41f5-8ca3-40b843941b4f" ma:termSetId="5b7703a5-8e8b-4b58-8b31-1cea35331da3" ma:anchorId="00000000-0000-0000-0000-000000000000" ma:open="false" ma:isKeyword="false">
-      <xsd:complexType>
-        <xsd:sequence>
-          <xsd:element ref="pc:Terms" minOccurs="0" maxOccurs="1"/>
-        </xsd:sequence>
-      </xsd:complexType>
-    </xsd:element>
-    <xsd:element name="MachineTranslated" ma:index="88" nillable="true" ma:displayName="Machine Translated" ma:default="" ma:internalName="MachineTranslated" ma:readOnly="false">
-      <xsd:simpleType>
-        <xsd:restriction base="dms:Boolean"/>
-      </xsd:simpleType>
-    </xsd:element>
-    <xsd:element name="Manager" ma:index="89" nillable="true" ma:displayName="Manager" ma:hidden="true" ma:internalName="Manager" ma:readOnly="false">
-      <xsd:simpleType>
-        <xsd:restriction base="dms:Text"/>
-      </xsd:simpleType>
-    </xsd:element>
-    <xsd:element name="Markets" ma:index="90" nillable="true" ma:displayName="Markets" ma:default="" ma:description="Leave blank to show in all markets" ma:list="{2FBD1B11-2ACE-4FDC-B5A3-635D4ADF6F1B}" ma:internalName="Markets" ma:readOnly="false" ma:showField="MarketName" ma:web="4873beb7-5857-4685-be1f-d57550cc96cc">
-      <xsd:complexType>
-        <xsd:complexContent>
-          <xsd:extension base="dms:MultiChoiceLookup">
-            <xsd:sequence>
-              <xsd:element name="Value" type="dms:Lookup" maxOccurs="unbounded" minOccurs="0" nillable="true"/>
-            </xsd:sequence>
-          </xsd:extension>
-        </xsd:complexContent>
-      </xsd:complexType>
-    </xsd:element>
-    <xsd:element name="Milestone" ma:index="91" nillable="true" ma:displayName="Milestone" ma:default="" ma:internalName="Milestone" ma:readOnly="false">
-      <xsd:simpleType>
-        <xsd:restriction base="dms:Unknown"/>
-      </xsd:simpleType>
-    </xsd:element>
-    <xsd:element name="TPNamespace" ma:index="94" nillable="true" ma:displayName="Namespace" ma:default="" ma:internalName="TPNamespace">
-      <xsd:simpleType>
-        <xsd:restriction base="dms:Text"/>
-      </xsd:simpleType>
-    </xsd:element>
-    <xsd:element name="NumericId" ma:index="95" nillable="true" ma:displayName="Numeric ID" ma:default="" ma:indexed="true" ma:internalName="NumericId" ma:readOnly="false">
-      <xsd:simpleType>
-        <xsd:restriction base="dms:Number"/>
-      </xsd:simpleType>
-    </xsd:element>
-    <xsd:element name="NumOfRatingsLookup" ma:index="96" nillable="true" ma:displayName="NumOfRatings" ma:default="" ma:list="{9E343742-310B-4684-A24C-1D137CB4B230}" ma:internalName="NumOfRatingsLookup" ma:readOnly="true" ma:showField="NumOfRatings" ma:web="4873beb7-5857-4685-be1f-d57550cc96cc">
-      <xsd:complexType>
-        <xsd:complexContent>
-          <xsd:extension base="dms:MultiChoiceLookup">
-            <xsd:sequence>
-              <xsd:element name="Value" type="dms:Lookup" maxOccurs="unbounded" minOccurs="0" nillable="true"/>
-            </xsd:sequence>
-          </xsd:extension>
-        </xsd:complexContent>
-      </xsd:complexType>
-    </xsd:element>
-    <xsd:element name="OOCacheId" ma:index="97" nillable="true" ma:displayName="OOCacheId" ma:internalName="OOCacheId" ma:readOnly="false">
-      <xsd:simpleType>
-        <xsd:restriction base="dms:Text"/>
-      </xsd:simpleType>
-    </xsd:element>
-    <xsd:element name="OpenTemplate" ma:index="98" nillable="true" ma:displayName="Open Template" ma:default="true" ma:internalName="OpenTemplate">
-      <xsd:simpleType>
-        <xsd:restriction base="dms:Boolean"/>
-      </xsd:simpleType>
-    </xsd:element>
-    <xsd:element name="OriginAsset" ma:index="99" nillable="true" ma:displayName="Origin Asset" ma:default="" ma:internalName="OriginAsset" ma:readOnly="false">
-      <xsd:simpleType>
-        <xsd:restriction base="dms:Text"/>
-      </xsd:simpleType>
-    </xsd:element>
-    <xsd:element name="OriginalRelease" ma:index="100" nillable="true" ma:displayName="Original Release" ma:default="15" ma:internalName="OriginalRelease" ma:readOnly="false">
-      <xsd:simpleType>
-        <xsd:restriction base="dms:Choice">
-          <xsd:enumeration value="14"/>
-          <xsd:enumeration value="15"/>
-          <xsd:enumeration value="16"/>
-        </xsd:restriction>
-      </xsd:simpleType>
-    </xsd:element>
-    <xsd:element name="OriginalSourceMarket" ma:index="101" nillable="true" ma:displayName="Original Source Market Group" ma:default="" ma:internalName="OriginalSourceMarket" ma:readOnly="false">
-      <xsd:simpleType>
-        <xsd:restriction base="dms:Text"/>
-      </xsd:simpleType>
-    </xsd:element>
-    <xsd:element name="OutputCachingOn" ma:index="102" nillable="true" ma:displayName="Output Caching" ma:default="true" ma:hidden="true" ma:internalName="OutputCachingOn" ma:readOnly="false">
-      <xsd:simpleType>
-        <xsd:restriction base="dms:Boolean"/>
-      </xsd:simpleType>
-    </xsd:element>
-    <xsd:element name="ParentAssetId" ma:index="103" nillable="true" ma:displayName="Parent Asset Id" ma:default="" ma:internalName="ParentAssetId" ma:readOnly="false">
-      <xsd:simpleType>
-        <xsd:restriction base="dms:Text"/>
-      </xsd:simpleType>
-    </xsd:element>
-    <xsd:element name="PlannedPubDate" ma:index="104" nillable="true" ma:displayName="Planned Publish Date" ma:default="" ma:indexed="true" ma:internalName="PlannedPubDate" ma:readOnly="false">
-      <xsd:simpleType>
-        <xsd:restriction base="dms:DateTime"/>
-      </xsd:simpleType>
-    </xsd:element>
-    <xsd:element name="PolicheckWords" ma:index="105" nillable="true" ma:displayName="Policheck Words" ma:default="" ma:internalName="PolicheckWords" ma:readOnly="false">
-      <xsd:simpleType>
-        <xsd:restriction base="dms:Text"/>
-      </xsd:simpleType>
-    </xsd:element>
-    <xsd:element name="BusinessGroup" ma:index="106" nillable="true" ma:displayName="Product Division Owner" ma:default="" ma:internalName="BusinessGroup" ma:readOnly="false">
-      <xsd:simpleType>
-        <xsd:restriction base="dms:Unknown"/>
-      </xsd:simpleType>
-    </xsd:element>
-    <xsd:element name="UAProjectedTotalWords" ma:index="107" nillable="true" ma:displayName="Projected Word Count" ma:default="" ma:internalName="UAProjectedTotalWords" ma:readOnly="false">
-      <xsd:simpleType>
-        <xsd:restriction base="dms:Unknown"/>
-      </xsd:simpleType>
-    </xsd:element>
-    <xsd:element name="Provider" ma:index="108" nillable="true" ma:displayName="Provider" ma:default="" ma:internalName="Provider" ma:readOnly="false">
-      <xsd:simpleType>
-        <xsd:restriction base="dms:Unknown"/>
-      </xsd:simpleType>
-    </xsd:element>
-    <xsd:element name="Providers" ma:index="109" nillable="true" ma:displayName="Providers" ma:default="" ma:internalName="Providers">
-      <xsd:simpleType>
-        <xsd:restriction base="dms:Unknown"/>
-      </xsd:simpleType>
-    </xsd:element>
-    <xsd:element name="PublishStatusLookup" ma:index="110" nillable="true" ma:displayName="Publish Status" ma:default="" ma:list="{9E343742-310B-4684-A24C-1D137CB4B230}" ma:internalName="PublishStatusLookup" ma:readOnly="false" ma:showField="PublishStatus" ma:web="4873beb7-5857-4685-be1f-d57550cc96cc">
-      <xsd:complexType>
-        <xsd:complexContent>
-          <xsd:extension base="dms:MultiChoiceLookup">
-            <xsd:sequence>
-              <xsd:element name="Value" type="dms:Lookup" maxOccurs="unbounded" minOccurs="0" nillable="true"/>
-            </xsd:sequence>
-          </xsd:extension>
-        </xsd:complexContent>
-      </xsd:complexType>
-    </xsd:element>
-    <xsd:element name="PublishTargets" ma:index="111" nillable="true" ma:displayName="Publish Target" ma:default="OfficeOnlineVNext" ma:internalName="PublishTargets" ma:readOnly="false">
-      <xsd:simpleType>
-        <xsd:restriction base="dms:Unknown"/>
-      </xsd:simpleType>
-    </xsd:element>
-    <xsd:element name="RecommendationsModifier" ma:index="112" nillable="true" ma:displayName="Recommendations Modifier" ma:default="" ma:internalName="RecommendationsModifier" ma:readOnly="false">
-      <xsd:simpleType>
-        <xsd:restriction base="dms:Number"/>
-      </xsd:simpleType>
-    </xsd:element>
-    <xsd:element name="ArtSampleDocs" ma:index="113" nillable="true" ma:displayName="Sample Docs" ma:default="" ma:hidden="true" ma:internalName="ArtSampleDocs" ma:readOnly="false">
-      <xsd:simpleType>
-        <xsd:restriction base="dms:Text"/>
-      </xsd:simpleType>
-    </xsd:element>
-    <xsd:element name="ScenarioTagsTaxHTField0" ma:index="115" nillable="true" ma:taxonomy="true" ma:internalName="ScenarioTagsTaxHTField0" ma:taxonomyFieldName="ScenarioTags" ma:displayName="Scenarios" ma:readOnly="false" ma:default="" ma:fieldId="{93aef74d-6c78-4815-8310-51477dceeccc}" ma:taxonomyMulti="true" ma:sspId="8f79753a-75d3-41f5-8ca3-40b843941b4f" ma:termSetId="4b7d5f16-e2f2-4fc0-bab3-6e8b931e57d6" ma:anchorId="00000000-0000-0000-0000-000000000000" ma:open="false" ma:isKeyword="false">
-      <xsd:complexType>
-        <xsd:sequence>
-          <xsd:element ref="pc:Terms" minOccurs="0" maxOccurs="1"/>
-        </xsd:sequence>
-      </xsd:complexType>
-    </xsd:element>
-    <xsd:element name="ShowIn" ma:index="117" nillable="true" ma:displayName="Show In" ma:default="Show everywhere" ma:internalName="ShowIn" ma:readOnly="false">
-      <xsd:simpleType>
-        <xsd:restriction base="dms:Choice">
-          <xsd:enumeration value="Hide on web"/>
-          <xsd:enumeration value="On Web no search"/>
-          <xsd:enumeration value="Show everywhere"/>
-          <xsd:enumeration value="Special use only"/>
-        </xsd:restriction>
-      </xsd:simpleType>
-    </xsd:element>
-    <xsd:element name="SourceTitle" ma:index="118" nillable="true" ma:displayName="Source Title" ma:default="" ma:indexed="true" ma:internalName="SourceTitle" ma:readOnly="false">
-      <xsd:simpleType>
-        <xsd:restriction base="dms:Text"/>
-      </xsd:simpleType>
-    </xsd:element>
-    <xsd:element name="CSXSubmissionDate" ma:index="119" nillable="true" ma:displayName="Submission Date" ma:default="" ma:internalName="CSXSubmissionDate" ma:readOnly="false">
-      <xsd:simpleType>
-        <xsd:restriction base="dms:DateTime"/>
-      </xsd:simpleType>
-    </xsd:element>
-    <xsd:element name="SubmitterId" ma:index="120" nillable="true" ma:displayName="Submitter ID" ma:default="" ma:internalName="SubmitterId" ma:readOnly="false">
-      <xsd:simpleType>
-        <xsd:restriction base="dms:Text"/>
-      </xsd:simpleType>
-    </xsd:element>
-    <xsd:element name="TaxCatchAll" ma:index="121" nillable="true" ma:displayName="Taxonomy Catch All Column" ma:hidden="true" ma:list="{530f955b-6704-4601-bd83-f81d87f1e440}" ma:internalName="TaxCatchAll" ma:showField="CatchAllData" ma:web="4873beb7-5857-4685-be1f-d57550cc96cc">
-      <xsd:complexType>
-        <xsd:complexContent>
-          <xsd:extension base="dms:MultiChoiceLookup">
-            <xsd:sequence>
-              <xsd:element name="Value" type="dms:Lookup" maxOccurs="unbounded" minOccurs="0" nillable="true"/>
-            </xsd:sequence>
-          </xsd:extension>
-        </xsd:complexContent>
-      </xsd:complexType>
-    </xsd:element>
-    <xsd:element name="TaxCatchAllLabel" ma:index="122" nillable="true" ma:displayName="Taxonomy Catch All Column1" ma:hidden="true" ma:list="{530f955b-6704-4601-bd83-f81d87f1e440}" ma:internalName="TaxCatchAllLabel" ma:readOnly="true" ma:showField="CatchAllDataLabel" ma:web="4873beb7-5857-4685-be1f-d57550cc96cc">
-      <xsd:complexType>
-        <xsd:complexContent>
-          <xsd:extension base="dms:MultiChoiceLookup">
-            <xsd:sequence>
-              <xsd:element name="Value" type="dms:Lookup" maxOccurs="unbounded" minOccurs="0" nillable="true"/>
-            </xsd:sequence>
-          </xsd:extension>
-        </xsd:complexContent>
-      </xsd:complexType>
-    </xsd:element>
-    <xsd:element name="TemplateStatus" ma:index="123" nillable="true" ma:displayName="Template Status" ma:default="" ma:internalName="TemplateStatus">
-      <xsd:simpleType>
-        <xsd:restriction base="dms:Unknown"/>
-      </xsd:simpleType>
-    </xsd:element>
-    <xsd:element name="TemplateTemplateType" ma:index="124" nillable="true" ma:displayName="Template Type" ma:default="" ma:internalName="TemplateTemplateType">
-      <xsd:simpleType>
-        <xsd:restriction base="dms:Unknown"/>
-      </xsd:simpleType>
-    </xsd:element>
-    <xsd:element name="ThumbnailAssetId" ma:index="125" nillable="true" ma:displayName="Thumbnail Image Asset" ma:default="" ma:internalName="ThumbnailAssetId" ma:readOnly="false">
-      <xsd:simpleType>
-        <xsd:restriction base="dms:Text"/>
-      </xsd:simpleType>
-    </xsd:element>
-    <xsd:element name="TimesCloned" ma:index="126" nillable="true" ma:displayName="Times Cloned" ma:default="" ma:internalName="TimesCloned" ma:readOnly="false">
-      <xsd:simpleType>
-        <xsd:restriction base="dms:Number"/>
-      </xsd:simpleType>
-    </xsd:element>
-    <xsd:element name="TrustLevel" ma:index="128" nillable="true" ma:displayName="Trust Level" ma:default="1 Microsoft Managed Content" ma:internalName="TrustLevel" ma:readOnly="false">
-      <xsd:simpleType>
-        <xsd:restriction base="dms:Unknown"/>
-      </xsd:simpleType>
-    </xsd:element>
-    <xsd:element name="UALocComments" ma:index="129" nillable="true" ma:displayName="UA Loc Comments" ma:default="" ma:internalName="UALocComments" ma:readOnly="false">
-      <xsd:simpleType>
-        <xsd:restriction base="dms:Note"/>
-      </xsd:simpleType>
-    </xsd:element>
-    <xsd:element name="UALocRecommendation" ma:index="130" nillable="true" ma:displayName="UA Loc Recommendation" ma:default="Localize" ma:internalName="UALocRecommendation" ma:readOnly="false">
-      <xsd:simpleType>
-        <xsd:restriction base="dms:Choice">
-          <xsd:enumeration value="Localize"/>
-          <xsd:enumeration value="Never Localize"/>
-          <xsd:enumeration value="Priority Localize"/>
-        </xsd:restriction>
-      </xsd:simpleType>
-    </xsd:element>
-    <xsd:element name="UANotes" ma:index="131" nillable="true" ma:displayName="UA Notes" ma:default="" ma:internalName="UANotes" ma:readOnly="false">
-      <xsd:simpleType>
-        <xsd:restriction base="dms:Note"/>
-      </xsd:simpleType>
-    </xsd:element>
-    <xsd:element name="TPAppVersion" ma:index="132" nillable="true" ma:displayName="Version" ma:default="" ma:internalName="TPAppVersion">
-      <xsd:simpleType>
-        <xsd:restriction base="dms:Text"/>
-      </xsd:simpleType>
-    </xsd:element>
-    <xsd:element name="VoteCount" ma:index="133" nillable="true" ma:displayName="Vote Count" ma:default="" ma:internalName="VoteCount" ma:readOnly="false">
-      <xsd:simpleType>
-        <xsd:restriction base="dms:Unknown"/>
-      </xsd:simpleType>
     </xsd:element>
   </xsd:schema>
   <xsd:schema xmlns="http://schemas.openxmlformats.org/package/2006/metadata/core-properties" xmlns:xsd="http://www.w3.org/2001/XMLSchema" xmlns:xsi="http://www.w3.org/2001/XMLSchema-instance" xmlns:dc="http://purl.org/dc/elements/1.1/" xmlns:dcterms="http://purl.org/dc/terms/" xmlns:odoc="http://schemas.microsoft.com/internal/obd" targetNamespace="http://schemas.openxmlformats.org/package/2006/metadata/core-properties" elementFormDefault="qualified" attributeFormDefault="unqualified" blockDefault="#all">
@@ -28929,8 +28347,8 @@
         <xsd:element ref="dc:creator" minOccurs="0" maxOccurs="1"/>
         <xsd:element ref="dcterms:created" minOccurs="0" maxOccurs="1"/>
         <xsd:element ref="dc:identifier" minOccurs="0" maxOccurs="1"/>
-        <xsd:element name="contentType" minOccurs="0" maxOccurs="1" type="xsd:string" ma:index="22" ma:displayName="Content Type"/>
-        <xsd:element ref="dc:title" minOccurs="0" maxOccurs="1" ma:index="127" ma:displayName="Title"/>
+        <xsd:element name="contentType" minOccurs="0" maxOccurs="1" type="xsd:string" ma:displayName="Tipo de Conteúdo"/>
+        <xsd:element ref="dc:title" minOccurs="0" maxOccurs="1" ma:index="1" ma:displayName="Título"/>
         <xsd:element ref="dc:subject" minOccurs="0" maxOccurs="1"/>
         <xsd:element ref="dc:description" minOccurs="0" maxOccurs="1"/>
         <xsd:element name="keywords" minOccurs="0" maxOccurs="1" type="xsd:string"/>
@@ -29022,137 +28440,56 @@
 <file path=customXml/item3.xml><?xml version="1.0" encoding="utf-8"?>
 <p:properties xmlns:p="http://schemas.microsoft.com/office/2006/metadata/properties" xmlns:xsi="http://www.w3.org/2001/XMLSchema-instance" xmlns:pc="http://schemas.microsoft.com/office/infopath/2007/PartnerControls">
   <documentManagement>
-    <LocLastLocAttemptVersionTypeLookup xmlns="4873beb7-5857-4685-be1f-d57550cc96cc" xsi:nil="true"/>
-    <MarketSpecific xmlns="4873beb7-5857-4685-be1f-d57550cc96cc">false</MarketSpecific>
-    <ApprovalStatus xmlns="4873beb7-5857-4685-be1f-d57550cc96cc">InProgress</ApprovalStatus>
-    <LocComments xmlns="4873beb7-5857-4685-be1f-d57550cc96cc" xsi:nil="true"/>
-    <DirectSourceMarket xmlns="4873beb7-5857-4685-be1f-d57550cc96cc" xsi:nil="true"/>
-    <LocPublishedLinkedAssetsLookup xmlns="4873beb7-5857-4685-be1f-d57550cc96cc" xsi:nil="true"/>
-    <ThumbnailAssetId xmlns="4873beb7-5857-4685-be1f-d57550cc96cc" xsi:nil="true"/>
-    <PrimaryImageGen xmlns="4873beb7-5857-4685-be1f-d57550cc96cc">true</PrimaryImageGen>
-    <LegacyData xmlns="4873beb7-5857-4685-be1f-d57550cc96cc" xsi:nil="true"/>
-    <LocNewPublishedVersionLookup xmlns="4873beb7-5857-4685-be1f-d57550cc96cc" xsi:nil="true"/>
-    <NumericId xmlns="4873beb7-5857-4685-be1f-d57550cc96cc">102787001</NumericId>
-    <TPFriendlyName xmlns="4873beb7-5857-4685-be1f-d57550cc96cc" xsi:nil="true"/>
-    <LocOverallPublishStatusLookup xmlns="4873beb7-5857-4685-be1f-d57550cc96cc" xsi:nil="true"/>
-    <LocRecommendedHandoff xmlns="4873beb7-5857-4685-be1f-d57550cc96cc" xsi:nil="true"/>
-    <BlockPublish xmlns="4873beb7-5857-4685-be1f-d57550cc96cc">false</BlockPublish>
-    <BusinessGroup xmlns="4873beb7-5857-4685-be1f-d57550cc96cc" xsi:nil="true"/>
-    <OpenTemplate xmlns="4873beb7-5857-4685-be1f-d57550cc96cc">true</OpenTemplate>
-    <SourceTitle xmlns="4873beb7-5857-4685-be1f-d57550cc96cc" xsi:nil="true"/>
-    <LocOverallLocStatusLookup xmlns="4873beb7-5857-4685-be1f-d57550cc96cc" xsi:nil="true"/>
-    <APEditor xmlns="4873beb7-5857-4685-be1f-d57550cc96cc">
+    <TaxCatchAll xmlns="29c85e31-c0e5-4fba-ab60-4fce8ca17cbc" xsi:nil="true"/>
+    <Guiadeservi_x00e7_o xmlns="86243fb6-e625-4153-bf24-3dbb8808cb3e" xsi:nil="true"/>
+    <TEXTO_x002d_BASE_x0020_DO_x0020_ESTUDO xmlns="86243fb6-e625-4153-bf24-3dbb8808cb3e" xsi:nil="true"/>
+    <Explique_x0020_a_x0020_rela_x00e7__x00e3_o_x0020_entre_x0020_institui_x00e7__x00f5_es_x0020_sociais_x0020_e_x0020_processos_x0020_de_x0020_socializa_x00e7__x00e3_o_x0020_na_x0020_forma_x00e7__x00e3_o_x0020_dos_x0020_comportamentos_x0020_observados_x0020_no_x0020_texto_x002e_ xmlns="86243fb6-e625-4153-bf24-3dbb8808cb3e"/>
+    <Eduarda_x002c_Lohanaevilma xmlns="86243fb6-e625-4153-bf24-3dbb8808cb3e" xsi:nil="true"/>
+    <Como_x0020_esse_x0020_problema_x0020_aparece_x0020_entre_x0020_os_x0020_jovens_x003f_ xmlns="86243fb6-e625-4153-bf24-3dbb8808cb3e"/>
+    <A_x0020_partir_x0020_do_x0020_caso_x0020_analisado_x002c__x0020_explique_x0020_como_x0020_os_x0020_conceitos_x0020_de_x0020_institui_x00e7__x00e3_o_x0020_social_x002c__x0020_socializa_x00e7__x00e3_o_x0020_e_x0020_papel_x0020_social_x0020_est_x00e3_o_x0020_interligados_x002e_ xmlns="86243fb6-e625-4153-bf24-3dbb8808cb3e"/>
+    <Indentidadevisualaula4 xmlns="86243fb6-e625-4153-bf24-3dbb8808cb3e" xsi:nil="true"/>
+    <Nomes xmlns="86243fb6-e625-4153-bf24-3dbb8808cb3e"/>
+    <No_x0020_texto_x002c__x0020_Camila_x0020_assume_x0020_a_x0020_fun_x00e7__x00e3_o_x0020_de_x0020_apresentar_x0020_o_x0020_trabalho_x0020_em_x0020_sala_x0020_de_x0020_aula_x002e__x0020_Explique_x0020_como_x0020_essa_x0020_situa_x00e7__x00e3_o_x0020_pode_x0020_ser_x0020_compreendida_x0020_a_x0020_partir_x0020_do_x0020_conceito_x0020_de_x0020_papel_x0020_social_x002e_ xmlns="86243fb6-e625-4153-bf24-3dbb8808cb3e"/>
+    <entrevista xmlns="86243fb6-e625-4153-bf24-3dbb8808cb3e" xsi:nil="true"/>
+    <Utilizando_x0020_o_x0020_conceito_x0020_de_x0020_apresenta_x00e7__x00e3_o_x0020_de_x0020_si_x002c__x0020_explique_x0020_como_x0020_o_x0020_comportamento_x0020_de_x0020_Camila_x0020_no_x0020_ambiente_x0020_de_x0020_trabalho_x0020_pode_x0020_ser_x0020_interpretado_x0020_sociologicamente_x002e_ xmlns="86243fb6-e625-4153-bf24-3dbb8808cb3e"/>
+    <O_x0020_caso_x0020_apresentado_x0020_mostra_x0020_que_x0020_diferentes_x0020_ambientes_x0020_possuem_x0020_normas_x0020_e_x0020_expectativas_x0020_espec_x00ed_ficas_x002e__x0020_Explique_x0020_por_x0020_que_x0020_a_x0020_exist_x00ea_ncia_x0020_dessas_x0020_normas_x0020__x00e9__x0020_importante_x0020_para_x0020_o_x0020_funcionamento_x0020_da_x0020_vida_x0020_social_x002e_ xmlns="86243fb6-e625-4153-bf24-3dbb8808cb3e"/>
+    <Como_x0020_a_x0020_Sociologia_x0020_poderia_x0020_explicar_x0020_isso_x003f_ xmlns="86243fb6-e625-4153-bf24-3dbb8808cb3e"/>
+    <Explique_x0020_por_x0020_que_x0020_uma_x0020_mesma_x0020_pessoa_x0020_pode_x0020_desempenhar_x0020_v_x00e1_rios_x0020_pap_x00e9_is_x0020_sociais_x0020_diferentes_x0020_ao_x0020_longo_x0020_de_x0020_um_x0020_mesmo_x0020_dia_x002e_ xmlns="86243fb6-e625-4153-bf24-3dbb8808cb3e"/>
+    <_Flow_SignoffStatus xmlns="86243fb6-e625-4153-bf24-3dbb8808cb3e" xsi:nil="true"/>
+    <lcf76f155ced4ddcb4097134ff3c332f xmlns="86243fb6-e625-4153-bf24-3dbb8808cb3e">
+      <Terms xmlns="http://schemas.microsoft.com/office/infopath/2007/PartnerControls"/>
+    </lcf76f155ced4ddcb4097134ff3c332f>
+    <Identifique_x0020_tr_x00ea_s_x0020_institui_x00e7__x00f5_es_x0020_sociais_x0020_presentes_x0020_no_x0020_caso_x0020_descrito_x0020_e_x0020_explique_x0020_brevemente_x0020_qual_x0020__x00e9__x0020_o_x0020_papel_x0020_de_x0020_cada_x0020_uma_x0020_na_x0020_organiza_x00e7__x00e3_o_x0020_da_x0020_vida_x0020_social_x002e_ xmlns="86243fb6-e625-4153-bf24-3dbb8808cb3e"/>
+    <AULASESCRITAS xmlns="86243fb6-e625-4153-bf24-3dbb8808cb3e" xsi:nil="true"/>
+    <emmanuelG xmlns="86243fb6-e625-4153-bf24-3dbb8808cb3e" xsi:nil="true"/>
+    <Explique_x002c__x0020_a_x0020_partir_x0020_do_x0020_texto_x002c__x0020_como_x0020_o_x0020_processo_x0020_de_x0020_socializa_x00e7__x00e3_o_x0020_contribui_x0020_para_x0020_que_x0020_Camila_x0020_consiga_x0020_agir_x0020_de_x0020_maneiras_x0020_diferentes_x0020_em_x0020_cada_x0020_ambiente_x0020_social_x002e_ xmlns="86243fb6-e625-4153-bf24-3dbb8808cb3e"/>
+    <A_x0020_partir_x0020_das_x0020_ideias_x0020_de_x0020_Erving_x0020_Goffman_x002c__x0020_explique_x0020_por_x0020_que_x0020_Camila_x0020_controla_x0020_sua_x0020_forma_x0020_de_x0020_falar_x0020_e_x0020_de_x0020_se_x0020_comportar_x0020_em_x0020_determinados_x0020_contextos_x0020_sociais_x002e_ xmlns="86243fb6-e625-4153-bf24-3dbb8808cb3e"/>
+    <_ApprovalAssignedTo xmlns="86243fb6-e625-4153-bf24-3dbb8808cb3e">
       <UserInfo>
         <DisplayName/>
         <AccountId xsi:nil="true"/>
         <AccountType/>
       </UserInfo>
-    </APEditor>
-    <UALocComments xmlns="4873beb7-5857-4685-be1f-d57550cc96cc" xsi:nil="true"/>
-    <IntlLangReviewDate xmlns="4873beb7-5857-4685-be1f-d57550cc96cc" xsi:nil="true"/>
-    <PublishStatusLookup xmlns="4873beb7-5857-4685-be1f-d57550cc96cc">
-      <Value>1343188</Value>
-    </PublishStatusLookup>
-    <ParentAssetId xmlns="4873beb7-5857-4685-be1f-d57550cc96cc" xsi:nil="true"/>
-    <FeatureTagsTaxHTField0 xmlns="4873beb7-5857-4685-be1f-d57550cc96cc">
-      <Terms xmlns="http://schemas.microsoft.com/office/infopath/2007/PartnerControls"/>
-    </FeatureTagsTaxHTField0>
-    <MachineTranslated xmlns="4873beb7-5857-4685-be1f-d57550cc96cc">false</MachineTranslated>
-    <Providers xmlns="4873beb7-5857-4685-be1f-d57550cc96cc" xsi:nil="true"/>
-    <OriginalSourceMarket xmlns="4873beb7-5857-4685-be1f-d57550cc96cc" xsi:nil="true"/>
-    <APDescription xmlns="4873beb7-5857-4685-be1f-d57550cc96cc" xsi:nil="true"/>
-    <ContentItem xmlns="4873beb7-5857-4685-be1f-d57550cc96cc" xsi:nil="true"/>
-    <ClipArtFilename xmlns="4873beb7-5857-4685-be1f-d57550cc96cc" xsi:nil="true"/>
-    <TPInstallLocation xmlns="4873beb7-5857-4685-be1f-d57550cc96cc" xsi:nil="true"/>
-    <TimesCloned xmlns="4873beb7-5857-4685-be1f-d57550cc96cc" xsi:nil="true"/>
-    <PublishTargets xmlns="4873beb7-5857-4685-be1f-d57550cc96cc">OfficeOnlineVNext</PublishTargets>
-    <AcquiredFrom xmlns="4873beb7-5857-4685-be1f-d57550cc96cc">Internal MS</AcquiredFrom>
-    <AssetStart xmlns="4873beb7-5857-4685-be1f-d57550cc96cc">2011-11-23T17:29:00+00:00</AssetStart>
-    <FriendlyTitle xmlns="4873beb7-5857-4685-be1f-d57550cc96cc" xsi:nil="true"/>
-    <Provider xmlns="4873beb7-5857-4685-be1f-d57550cc96cc" xsi:nil="true"/>
-    <LastHandOff xmlns="4873beb7-5857-4685-be1f-d57550cc96cc" xsi:nil="true"/>
-    <TPClientViewer xmlns="4873beb7-5857-4685-be1f-d57550cc96cc" xsi:nil="true"/>
-    <TemplateStatus xmlns="4873beb7-5857-4685-be1f-d57550cc96cc">Complete</TemplateStatus>
-    <Downloads xmlns="4873beb7-5857-4685-be1f-d57550cc96cc">0</Downloads>
-    <OOCacheId xmlns="4873beb7-5857-4685-be1f-d57550cc96cc" xsi:nil="true"/>
-    <IsDeleted xmlns="4873beb7-5857-4685-be1f-d57550cc96cc">false</IsDeleted>
-    <LocPublishedDependentAssetsLookup xmlns="4873beb7-5857-4685-be1f-d57550cc96cc" xsi:nil="true"/>
-    <AssetExpire xmlns="4873beb7-5857-4685-be1f-d57550cc96cc">2029-05-12T07:00:00+00:00</AssetExpire>
-    <CSXSubmissionMarket xmlns="4873beb7-5857-4685-be1f-d57550cc96cc" xsi:nil="true"/>
-    <DSATActionTaken xmlns="4873beb7-5857-4685-be1f-d57550cc96cc" xsi:nil="true"/>
-    <SubmitterId xmlns="4873beb7-5857-4685-be1f-d57550cc96cc" xsi:nil="true"/>
-    <EditorialTags xmlns="4873beb7-5857-4685-be1f-d57550cc96cc" xsi:nil="true"/>
-    <TPExecutable xmlns="4873beb7-5857-4685-be1f-d57550cc96cc" xsi:nil="true"/>
-    <CSXSubmissionDate xmlns="4873beb7-5857-4685-be1f-d57550cc96cc" xsi:nil="true"/>
-    <CSXUpdate xmlns="4873beb7-5857-4685-be1f-d57550cc96cc">false</CSXUpdate>
-    <AssetType xmlns="4873beb7-5857-4685-be1f-d57550cc96cc">TP</AssetType>
-    <ApprovalLog xmlns="4873beb7-5857-4685-be1f-d57550cc96cc" xsi:nil="true"/>
-    <BugNumber xmlns="4873beb7-5857-4685-be1f-d57550cc96cc" xsi:nil="true"/>
-    <OriginAsset xmlns="4873beb7-5857-4685-be1f-d57550cc96cc" xsi:nil="true"/>
-    <TPComponent xmlns="4873beb7-5857-4685-be1f-d57550cc96cc" xsi:nil="true"/>
-    <Milestone xmlns="4873beb7-5857-4685-be1f-d57550cc96cc" xsi:nil="true"/>
-    <RecommendationsModifier xmlns="4873beb7-5857-4685-be1f-d57550cc96cc" xsi:nil="true"/>
-    <AssetId xmlns="4873beb7-5857-4685-be1f-d57550cc96cc">TP102787001</AssetId>
-    <PolicheckWords xmlns="4873beb7-5857-4685-be1f-d57550cc96cc" xsi:nil="true"/>
-    <TPLaunchHelpLink xmlns="4873beb7-5857-4685-be1f-d57550cc96cc" xsi:nil="true"/>
-    <IntlLocPriority xmlns="4873beb7-5857-4685-be1f-d57550cc96cc" xsi:nil="true"/>
-    <TPApplication xmlns="4873beb7-5857-4685-be1f-d57550cc96cc" xsi:nil="true"/>
-    <IntlLangReviewer xmlns="4873beb7-5857-4685-be1f-d57550cc96cc" xsi:nil="true"/>
-    <HandoffToMSDN xmlns="4873beb7-5857-4685-be1f-d57550cc96cc" xsi:nil="true"/>
-    <PlannedPubDate xmlns="4873beb7-5857-4685-be1f-d57550cc96cc" xsi:nil="true"/>
-    <CrawlForDependencies xmlns="4873beb7-5857-4685-be1f-d57550cc96cc">false</CrawlForDependencies>
-    <LocLastLocAttemptVersionLookup xmlns="4873beb7-5857-4685-be1f-d57550cc96cc">693888</LocLastLocAttemptVersionLookup>
-    <LocProcessedForHandoffsLookup xmlns="4873beb7-5857-4685-be1f-d57550cc96cc" xsi:nil="true"/>
-    <TrustLevel xmlns="4873beb7-5857-4685-be1f-d57550cc96cc">1 Microsoft Managed Content</TrustLevel>
-    <CampaignTagsTaxHTField0 xmlns="4873beb7-5857-4685-be1f-d57550cc96cc">
-      <Terms xmlns="http://schemas.microsoft.com/office/infopath/2007/PartnerControls"/>
-    </CampaignTagsTaxHTField0>
-    <TPNamespace xmlns="4873beb7-5857-4685-be1f-d57550cc96cc" xsi:nil="true"/>
-    <LocOverallPreviewStatusLookup xmlns="4873beb7-5857-4685-be1f-d57550cc96cc" xsi:nil="true"/>
-    <TaxCatchAll xmlns="4873beb7-5857-4685-be1f-d57550cc96cc"/>
-    <IsSearchable xmlns="4873beb7-5857-4685-be1f-d57550cc96cc">false</IsSearchable>
-    <TemplateTemplateType xmlns="4873beb7-5857-4685-be1f-d57550cc96cc">Word Document Template</TemplateTemplateType>
-    <Markets xmlns="4873beb7-5857-4685-be1f-d57550cc96cc"/>
-    <IntlLangReview xmlns="4873beb7-5857-4685-be1f-d57550cc96cc" xsi:nil="true"/>
-    <UAProjectedTotalWords xmlns="4873beb7-5857-4685-be1f-d57550cc96cc" xsi:nil="true"/>
-    <OutputCachingOn xmlns="4873beb7-5857-4685-be1f-d57550cc96cc">false</OutputCachingOn>
-    <AverageRating xmlns="4873beb7-5857-4685-be1f-d57550cc96cc" xsi:nil="true"/>
-    <LocMarketGroupTiers2 xmlns="4873beb7-5857-4685-be1f-d57550cc96cc" xsi:nil="true"/>
-    <APAuthor xmlns="4873beb7-5857-4685-be1f-d57550cc96cc">
+    </_ApprovalAssignedTo>
+    <_ApprovalStatus xmlns="86243fb6-e625-4153-bf24-3dbb8808cb3e">0</_ApprovalStatus>
+    <_ApprovalRespondedBy xmlns="86243fb6-e625-4153-bf24-3dbb8808cb3e">
       <UserInfo>
-        <DisplayName>REDMOND\v-namall</DisplayName>
-        <AccountId>978</AccountId>
+        <DisplayName/>
+        <AccountId xsi:nil="true"/>
         <AccountType/>
       </UserInfo>
-    </APAuthor>
-    <TPCommandLine xmlns="4873beb7-5857-4685-be1f-d57550cc96cc" xsi:nil="true"/>
-    <LocManualTestRequired xmlns="4873beb7-5857-4685-be1f-d57550cc96cc">false</LocManualTestRequired>
-    <TPAppVersion xmlns="4873beb7-5857-4685-be1f-d57550cc96cc" xsi:nil="true"/>
-    <EditorialStatus xmlns="4873beb7-5857-4685-be1f-d57550cc96cc">Complete</EditorialStatus>
-    <LocProcessedForMarketsLookup xmlns="4873beb7-5857-4685-be1f-d57550cc96cc" xsi:nil="true"/>
-    <LastModifiedDateTime xmlns="4873beb7-5857-4685-be1f-d57550cc96cc" xsi:nil="true"/>
-    <TPLaunchHelpLinkType xmlns="4873beb7-5857-4685-be1f-d57550cc96cc">Template</TPLaunchHelpLinkType>
-    <ScenarioTagsTaxHTField0 xmlns="4873beb7-5857-4685-be1f-d57550cc96cc">
-      <Terms xmlns="http://schemas.microsoft.com/office/infopath/2007/PartnerControls"/>
-    </ScenarioTagsTaxHTField0>
-    <OriginalRelease xmlns="4873beb7-5857-4685-be1f-d57550cc96cc">14</OriginalRelease>
-    <LocalizationTagsTaxHTField0 xmlns="4873beb7-5857-4685-be1f-d57550cc96cc">
-      <Terms xmlns="http://schemas.microsoft.com/office/infopath/2007/PartnerControls"/>
-    </LocalizationTagsTaxHTField0>
-    <Manager xmlns="4873beb7-5857-4685-be1f-d57550cc96cc" xsi:nil="true"/>
-    <UALocRecommendation xmlns="4873beb7-5857-4685-be1f-d57550cc96cc">Localize</UALocRecommendation>
-    <LocOverallHandbackStatusLookup xmlns="4873beb7-5857-4685-be1f-d57550cc96cc" xsi:nil="true"/>
-    <ArtSampleDocs xmlns="4873beb7-5857-4685-be1f-d57550cc96cc" xsi:nil="true"/>
-    <UACurrentWords xmlns="4873beb7-5857-4685-be1f-d57550cc96cc" xsi:nil="true"/>
-    <ShowIn xmlns="4873beb7-5857-4685-be1f-d57550cc96cc">Show everywhere</ShowIn>
-    <CSXHash xmlns="4873beb7-5857-4685-be1f-d57550cc96cc" xsi:nil="true"/>
-    <VoteCount xmlns="4873beb7-5857-4685-be1f-d57550cc96cc" xsi:nil="true"/>
-    <InternalTagsTaxHTField0 xmlns="4873beb7-5857-4685-be1f-d57550cc96cc">
-      <Terms xmlns="http://schemas.microsoft.com/office/infopath/2007/PartnerControls"/>
-    </InternalTagsTaxHTField0>
-    <UANotes xmlns="4873beb7-5857-4685-be1f-d57550cc96cc" xsi:nil="true"/>
+    </_ApprovalRespondedBy>
   </documentManagement>
 </p:properties>
+</file>
+
+<file path=customXml/item4.xml><?xml version="1.0" encoding="utf-8"?>
+<?mso-contentType ?>
+<FormTemplates xmlns="http://schemas.microsoft.com/sharepoint/v3/contenttype/forms">
+  <Display>DocumentLibraryForm</Display>
+  <Edit>DocumentLibraryForm</Edit>
+  <New>DocumentLibraryForm</New>
+</FormTemplates>
 </file>
 
 <file path=customXml/itemProps1.xml><?xml version="1.0" encoding="utf-8"?>
@@ -29164,21 +28501,7 @@
 </file>
 
 <file path=customXml/itemProps2.xml><?xml version="1.0" encoding="utf-8"?>
-<ds:datastoreItem xmlns:ds="http://schemas.openxmlformats.org/officeDocument/2006/customXml" ds:itemID="{4B3A7E92-E05A-4924-9E8A-9F6659E5855B}">
-  <ds:schemaRefs>
-    <ds:schemaRef ds:uri="http://schemas.microsoft.com/office/2006/metadata/contentType"/>
-    <ds:schemaRef ds:uri="http://schemas.microsoft.com/office/2006/metadata/properties/metaAttributes"/>
-    <ds:schemaRef ds:uri="http://www.w3.org/2001/XMLSchema"/>
-    <ds:schemaRef ds:uri="http://schemas.microsoft.com/office/2006/metadata/properties"/>
-    <ds:schemaRef ds:uri="4873beb7-5857-4685-be1f-d57550cc96cc"/>
-    <ds:schemaRef ds:uri="http://schemas.microsoft.com/office/2006/documentManagement/types"/>
-    <ds:schemaRef ds:uri="http://schemas.microsoft.com/office/infopath/2007/PartnerControls"/>
-    <ds:schemaRef ds:uri="http://schemas.openxmlformats.org/package/2006/metadata/core-properties"/>
-    <ds:schemaRef ds:uri="http://purl.org/dc/elements/1.1/"/>
-    <ds:schemaRef ds:uri="http://purl.org/dc/terms/"/>
-    <ds:schemaRef ds:uri="http://schemas.microsoft.com/internal/obd"/>
-  </ds:schemaRefs>
-</ds:datastoreItem>
+<ds:datastoreItem xmlns:ds="http://schemas.openxmlformats.org/officeDocument/2006/customXml" ds:itemID="{F4C6665D-904C-45EA-9F01-20439E414941}"/>
 </file>
 
 <file path=customXml/itemProps3.xml><?xml version="1.0" encoding="utf-8"?>
@@ -29189,4 +28512,8 @@
     <ds:schemaRef ds:uri="4873beb7-5857-4685-be1f-d57550cc96cc"/>
   </ds:schemaRefs>
 </ds:datastoreItem>
+</file>
+
+<file path=customXml/itemProps4.xml><?xml version="1.0" encoding="utf-8"?>
+<ds:datastoreItem xmlns:ds="http://schemas.openxmlformats.org/officeDocument/2006/customXml" ds:itemID="{D29573A3-B055-4D45-92D5-D5081142AAFA}"/>
 </file>
</xml_diff>